<commit_message>
Actualizar contenido: UD7 2º ESO, imágenes assets, mejoras en todas las unidades y página principal
</commit_message>
<xml_diff>
--- a/1CyR.docx
+++ b/1CyR.docx
@@ -2947,7 +2947,7 @@
         <w:pStyle w:val="NormalWeb"/>
         <w:numPr>
           <w:ilvl w:val="0"/>
-          <w:numId w:val="27"/>
+          <w:numId w:val="10"/>
         </w:numPr>
       </w:pPr>
       <w:r>
@@ -2966,7 +2966,7 @@
         <w:pStyle w:val="NormalWeb"/>
         <w:numPr>
           <w:ilvl w:val="0"/>
-          <w:numId w:val="27"/>
+          <w:numId w:val="10"/>
         </w:numPr>
       </w:pPr>
       <w:r>
@@ -2982,7 +2982,7 @@
         <w:pStyle w:val="NormalWeb"/>
         <w:numPr>
           <w:ilvl w:val="1"/>
-          <w:numId w:val="27"/>
+          <w:numId w:val="10"/>
         </w:numPr>
       </w:pPr>
       <w:r>
@@ -3001,7 +3001,7 @@
         <w:pStyle w:val="NormalWeb"/>
         <w:numPr>
           <w:ilvl w:val="0"/>
-          <w:numId w:val="27"/>
+          <w:numId w:val="10"/>
         </w:numPr>
       </w:pPr>
       <w:r>
@@ -3017,7 +3017,7 @@
         <w:pStyle w:val="NormalWeb"/>
         <w:numPr>
           <w:ilvl w:val="1"/>
-          <w:numId w:val="27"/>
+          <w:numId w:val="10"/>
         </w:numPr>
       </w:pPr>
       <w:r>
@@ -3036,7 +3036,7 @@
         <w:pStyle w:val="NormalWeb"/>
         <w:numPr>
           <w:ilvl w:val="1"/>
-          <w:numId w:val="27"/>
+          <w:numId w:val="10"/>
         </w:numPr>
       </w:pPr>
       <w:r>
@@ -3067,7 +3067,7 @@
         <w:pStyle w:val="NormalWeb"/>
         <w:numPr>
           <w:ilvl w:val="1"/>
-          <w:numId w:val="27"/>
+          <w:numId w:val="10"/>
         </w:numPr>
       </w:pPr>
       <w:r>
@@ -3096,7 +3096,7 @@
         <w:pStyle w:val="NormalWeb"/>
         <w:numPr>
           <w:ilvl w:val="1"/>
-          <w:numId w:val="27"/>
+          <w:numId w:val="10"/>
         </w:numPr>
       </w:pPr>
       <w:r>
@@ -3130,7 +3130,7 @@
         <w:pStyle w:val="NormalWeb"/>
         <w:numPr>
           <w:ilvl w:val="0"/>
-          <w:numId w:val="28"/>
+          <w:numId w:val="11"/>
         </w:numPr>
       </w:pPr>
       <w:r>
@@ -3149,7 +3149,7 @@
         <w:pStyle w:val="NormalWeb"/>
         <w:numPr>
           <w:ilvl w:val="0"/>
-          <w:numId w:val="28"/>
+          <w:numId w:val="11"/>
         </w:numPr>
       </w:pPr>
       <w:r>
@@ -3165,7 +3165,7 @@
         <w:pStyle w:val="NormalWeb"/>
         <w:numPr>
           <w:ilvl w:val="1"/>
-          <w:numId w:val="28"/>
+          <w:numId w:val="11"/>
         </w:numPr>
       </w:pPr>
       <w:r>
@@ -3184,7 +3184,7 @@
         <w:pStyle w:val="NormalWeb"/>
         <w:numPr>
           <w:ilvl w:val="0"/>
-          <w:numId w:val="28"/>
+          <w:numId w:val="11"/>
         </w:numPr>
       </w:pPr>
       <w:r>
@@ -3208,7 +3208,7 @@
         <w:pStyle w:val="NormalWeb"/>
         <w:numPr>
           <w:ilvl w:val="1"/>
-          <w:numId w:val="28"/>
+          <w:numId w:val="11"/>
         </w:numPr>
       </w:pPr>
       <w:r>
@@ -3237,7 +3237,7 @@
         <w:pStyle w:val="NormalWeb"/>
         <w:numPr>
           <w:ilvl w:val="1"/>
-          <w:numId w:val="28"/>
+          <w:numId w:val="11"/>
         </w:numPr>
       </w:pPr>
       <w:r>
@@ -3279,7 +3279,7 @@
         <w:pStyle w:val="NormalWeb"/>
         <w:numPr>
           <w:ilvl w:val="0"/>
-          <w:numId w:val="29"/>
+          <w:numId w:val="12"/>
         </w:numPr>
       </w:pPr>
       <w:r>
@@ -3298,7 +3298,7 @@
         <w:pStyle w:val="NormalWeb"/>
         <w:numPr>
           <w:ilvl w:val="0"/>
-          <w:numId w:val="29"/>
+          <w:numId w:val="12"/>
         </w:numPr>
       </w:pPr>
       <w:r>
@@ -3314,7 +3314,7 @@
         <w:pStyle w:val="NormalWeb"/>
         <w:numPr>
           <w:ilvl w:val="1"/>
-          <w:numId w:val="29"/>
+          <w:numId w:val="12"/>
         </w:numPr>
       </w:pPr>
       <w:r>
@@ -3333,7 +3333,7 @@
         <w:pStyle w:val="NormalWeb"/>
         <w:numPr>
           <w:ilvl w:val="1"/>
-          <w:numId w:val="29"/>
+          <w:numId w:val="12"/>
         </w:numPr>
       </w:pPr>
       <w:r>
@@ -3353,7 +3353,7 @@
         <w:pStyle w:val="NormalWeb"/>
         <w:numPr>
           <w:ilvl w:val="0"/>
-          <w:numId w:val="29"/>
+          <w:numId w:val="12"/>
         </w:numPr>
       </w:pPr>
       <w:r>
@@ -3369,7 +3369,7 @@
         <w:pStyle w:val="NormalWeb"/>
         <w:numPr>
           <w:ilvl w:val="1"/>
-          <w:numId w:val="29"/>
+          <w:numId w:val="12"/>
         </w:numPr>
       </w:pPr>
       <w:r>
@@ -3388,7 +3388,7 @@
         <w:pStyle w:val="NormalWeb"/>
         <w:numPr>
           <w:ilvl w:val="1"/>
-          <w:numId w:val="29"/>
+          <w:numId w:val="12"/>
         </w:numPr>
       </w:pPr>
       <w:r>
@@ -3419,7 +3419,7 @@
         <w:pStyle w:val="NormalWeb"/>
         <w:numPr>
           <w:ilvl w:val="1"/>
-          <w:numId w:val="29"/>
+          <w:numId w:val="12"/>
         </w:numPr>
       </w:pPr>
       <w:r>
@@ -3445,7 +3445,7 @@
         <w:pStyle w:val="NormalWeb"/>
         <w:numPr>
           <w:ilvl w:val="1"/>
-          <w:numId w:val="29"/>
+          <w:numId w:val="12"/>
         </w:numPr>
       </w:pPr>
       <w:r>
@@ -3472,7 +3472,7 @@
         <w:pStyle w:val="NormalWeb"/>
         <w:numPr>
           <w:ilvl w:val="0"/>
-          <w:numId w:val="30"/>
+          <w:numId w:val="13"/>
         </w:numPr>
       </w:pPr>
       <w:r>
@@ -3491,7 +3491,7 @@
         <w:pStyle w:val="NormalWeb"/>
         <w:numPr>
           <w:ilvl w:val="0"/>
-          <w:numId w:val="30"/>
+          <w:numId w:val="13"/>
         </w:numPr>
       </w:pPr>
       <w:r>
@@ -3507,7 +3507,7 @@
         <w:pStyle w:val="NormalWeb"/>
         <w:numPr>
           <w:ilvl w:val="1"/>
-          <w:numId w:val="30"/>
+          <w:numId w:val="13"/>
         </w:numPr>
       </w:pPr>
       <w:r>
@@ -3526,7 +3526,7 @@
         <w:pStyle w:val="NormalWeb"/>
         <w:numPr>
           <w:ilvl w:val="0"/>
-          <w:numId w:val="30"/>
+          <w:numId w:val="13"/>
         </w:numPr>
       </w:pPr>
       <w:r>
@@ -3542,7 +3542,7 @@
         <w:pStyle w:val="NormalWeb"/>
         <w:numPr>
           <w:ilvl w:val="1"/>
-          <w:numId w:val="30"/>
+          <w:numId w:val="13"/>
         </w:numPr>
       </w:pPr>
       <w:r>
@@ -3571,7 +3571,7 @@
         <w:pStyle w:val="NormalWeb"/>
         <w:numPr>
           <w:ilvl w:val="1"/>
-          <w:numId w:val="30"/>
+          <w:numId w:val="13"/>
         </w:numPr>
       </w:pPr>
       <w:r>
@@ -3606,7 +3606,7 @@
         <w:pStyle w:val="NormalWeb"/>
         <w:numPr>
           <w:ilvl w:val="0"/>
-          <w:numId w:val="31"/>
+          <w:numId w:val="14"/>
         </w:numPr>
       </w:pPr>
       <w:r>
@@ -3625,7 +3625,7 @@
         <w:pStyle w:val="NormalWeb"/>
         <w:numPr>
           <w:ilvl w:val="0"/>
-          <w:numId w:val="31"/>
+          <w:numId w:val="14"/>
         </w:numPr>
       </w:pPr>
       <w:r>
@@ -3641,7 +3641,7 @@
         <w:pStyle w:val="NormalWeb"/>
         <w:numPr>
           <w:ilvl w:val="1"/>
-          <w:numId w:val="31"/>
+          <w:numId w:val="14"/>
         </w:numPr>
       </w:pPr>
       <w:r>
@@ -3660,7 +3660,7 @@
         <w:pStyle w:val="NormalWeb"/>
         <w:numPr>
           <w:ilvl w:val="1"/>
-          <w:numId w:val="31"/>
+          <w:numId w:val="14"/>
         </w:numPr>
       </w:pPr>
       <w:r>
@@ -3679,7 +3679,7 @@
         <w:pStyle w:val="NormalWeb"/>
         <w:numPr>
           <w:ilvl w:val="0"/>
-          <w:numId w:val="31"/>
+          <w:numId w:val="14"/>
         </w:numPr>
       </w:pPr>
       <w:r>
@@ -3695,7 +3695,7 @@
         <w:pStyle w:val="NormalWeb"/>
         <w:numPr>
           <w:ilvl w:val="1"/>
-          <w:numId w:val="31"/>
+          <w:numId w:val="14"/>
         </w:numPr>
       </w:pPr>
       <w:r>
@@ -3724,7 +3724,7 @@
         <w:pStyle w:val="NormalWeb"/>
         <w:numPr>
           <w:ilvl w:val="1"/>
-          <w:numId w:val="31"/>
+          <w:numId w:val="14"/>
         </w:numPr>
       </w:pPr>
       <w:r>
@@ -3743,7 +3743,7 @@
         <w:pStyle w:val="NormalWeb"/>
         <w:numPr>
           <w:ilvl w:val="1"/>
-          <w:numId w:val="31"/>
+          <w:numId w:val="14"/>
         </w:numPr>
       </w:pPr>
       <w:r>
@@ -3763,7 +3763,7 @@
         <w:pStyle w:val="NormalWeb"/>
         <w:numPr>
           <w:ilvl w:val="1"/>
-          <w:numId w:val="31"/>
+          <w:numId w:val="14"/>
         </w:numPr>
       </w:pPr>
       <w:r>
@@ -3800,7 +3800,7 @@
         <w:pStyle w:val="NormalWeb"/>
         <w:numPr>
           <w:ilvl w:val="0"/>
-          <w:numId w:val="32"/>
+          <w:numId w:val="15"/>
         </w:numPr>
       </w:pPr>
       <w:r>
@@ -3819,7 +3819,7 @@
         <w:pStyle w:val="NormalWeb"/>
         <w:numPr>
           <w:ilvl w:val="0"/>
-          <w:numId w:val="32"/>
+          <w:numId w:val="15"/>
         </w:numPr>
       </w:pPr>
       <w:r>
@@ -3835,7 +3835,7 @@
         <w:pStyle w:val="NormalWeb"/>
         <w:numPr>
           <w:ilvl w:val="1"/>
-          <w:numId w:val="32"/>
+          <w:numId w:val="15"/>
         </w:numPr>
       </w:pPr>
       <w:r>
@@ -3854,7 +3854,7 @@
         <w:pStyle w:val="NormalWeb"/>
         <w:numPr>
           <w:ilvl w:val="1"/>
-          <w:numId w:val="32"/>
+          <w:numId w:val="15"/>
         </w:numPr>
       </w:pPr>
       <w:r>
@@ -3873,7 +3873,7 @@
         <w:pStyle w:val="NormalWeb"/>
         <w:numPr>
           <w:ilvl w:val="0"/>
-          <w:numId w:val="32"/>
+          <w:numId w:val="15"/>
         </w:numPr>
       </w:pPr>
       <w:r>
@@ -3889,7 +3889,7 @@
         <w:pStyle w:val="NormalWeb"/>
         <w:numPr>
           <w:ilvl w:val="1"/>
-          <w:numId w:val="32"/>
+          <w:numId w:val="15"/>
         </w:numPr>
       </w:pPr>
       <w:r>
@@ -3918,7 +3918,7 @@
         <w:pStyle w:val="NormalWeb"/>
         <w:numPr>
           <w:ilvl w:val="1"/>
-          <w:numId w:val="32"/>
+          <w:numId w:val="15"/>
         </w:numPr>
       </w:pPr>
       <w:r>
@@ -3937,7 +3937,7 @@
         <w:pStyle w:val="NormalWeb"/>
         <w:numPr>
           <w:ilvl w:val="1"/>
-          <w:numId w:val="32"/>
+          <w:numId w:val="15"/>
         </w:numPr>
       </w:pPr>
       <w:r>
@@ -4918,6 +4918,1174 @@
     </w:p>
     <w:p>
       <w:pPr>
+        <w:pStyle w:val="Ttulo2"/>
+      </w:pPr>
+      <w:r>
+        <w:t>UNIDAD DIDÁCTICA 1: Ciudadanía Digital, Ciberseguridad y Propiedad Intelectual</w:t>
+      </w:r>
+    </w:p>
+    <w:p>
+      <w:pPr>
+        <w:pStyle w:val="NormalWeb"/>
+        <w:numPr>
+          <w:ilvl w:val="0"/>
+          <w:numId w:val="16"/>
+        </w:numPr>
+      </w:pPr>
+      <w:r>
+        <w:rPr>
+          <w:b/>
+          <w:bCs/>
+        </w:rPr>
+        <w:t>Duración:</w:t>
+      </w:r>
+      <w:r>
+        <w:t xml:space="preserve"> 1.º Trimestre (Semanas 1 a 6) – 12 sesiones aprox.</w:t>
+      </w:r>
+    </w:p>
+    <w:p>
+      <w:pPr>
+        <w:pStyle w:val="NormalWeb"/>
+        <w:numPr>
+          <w:ilvl w:val="0"/>
+          <w:numId w:val="16"/>
+        </w:numPr>
+      </w:pPr>
+      <w:r>
+        <w:rPr>
+          <w:b/>
+          <w:bCs/>
+        </w:rPr>
+        <w:t>Bloque de Saberes:</w:t>
+      </w:r>
+      <w:r>
+        <w:t xml:space="preserve"> </w:t>
+      </w:r>
+      <w:r>
+        <w:rPr>
+          <w:b/>
+          <w:bCs/>
+        </w:rPr>
+        <w:t>Bloque I: Ciberseguridad</w:t>
+      </w:r>
+      <w:r>
+        <w:t xml:space="preserve"> (CYR.1.I.1, CYR.1.I.2, CYR.1.I.3, CYR.1.I.4, CYR.1.I.5). </w:t>
+      </w:r>
+    </w:p>
+    <w:p>
+      <w:pPr>
+        <w:pStyle w:val="NormalWeb"/>
+        <w:numPr>
+          <w:ilvl w:val="0"/>
+          <w:numId w:val="16"/>
+        </w:numPr>
+      </w:pPr>
+      <w:r>
+        <w:rPr>
+          <w:b/>
+          <w:bCs/>
+        </w:rPr>
+        <w:t>Criterios de Evaluación:</w:t>
+      </w:r>
+      <w:r>
+        <w:t xml:space="preserve"> </w:t>
+      </w:r>
+      <w:r>
+        <w:rPr>
+          <w:b/>
+          <w:bCs/>
+        </w:rPr>
+        <w:t>6.1, 6.2, 6.3, 6.4</w:t>
+      </w:r>
+      <w:r>
+        <w:t xml:space="preserve">. </w:t>
+      </w:r>
+    </w:p>
+    <w:p>
+      <w:pPr>
+        <w:pStyle w:val="Ttulo3"/>
+      </w:pPr>
+      <w:r>
+        <w:t>1. Detalle de Contenidos</w:t>
+      </w:r>
+    </w:p>
+    <w:p>
+      <w:pPr>
+        <w:pStyle w:val="NormalWeb"/>
+        <w:numPr>
+          <w:ilvl w:val="0"/>
+          <w:numId w:val="17"/>
+        </w:numPr>
+      </w:pPr>
+      <w:r>
+        <w:rPr>
+          <w:b/>
+          <w:bCs/>
+        </w:rPr>
+        <w:t>Seguridad Activa y Pasiva:</w:t>
+      </w:r>
+      <w:r>
+        <w:t xml:space="preserve"> Concepto y diferenciación; contraseñas seguras, autenticación en dos pasos (2FA), copias de seguridad y actualización de sistemas. </w:t>
+      </w:r>
+    </w:p>
+    <w:p>
+      <w:pPr>
+        <w:pStyle w:val="NormalWeb"/>
+        <w:numPr>
+          <w:ilvl w:val="0"/>
+          <w:numId w:val="17"/>
+        </w:numPr>
+      </w:pPr>
+      <w:r>
+        <w:rPr>
+          <w:b/>
+          <w:bCs/>
+        </w:rPr>
+        <w:t>Exposición del Usuario y Peligros en Internet:</w:t>
+      </w:r>
+      <w:r>
+        <w:t xml:space="preserve"> Huella digital, identidad digital, </w:t>
+      </w:r>
+      <w:r>
+        <w:rPr>
+          <w:i/>
+          <w:iCs/>
+        </w:rPr>
+        <w:t>phishing</w:t>
+      </w:r>
+      <w:r>
+        <w:t xml:space="preserve">, </w:t>
+      </w:r>
+      <w:r>
+        <w:rPr>
+          <w:i/>
+          <w:iCs/>
+        </w:rPr>
+        <w:t>malware</w:t>
+      </w:r>
+      <w:r>
+        <w:t xml:space="preserve">, </w:t>
+      </w:r>
+      <w:r>
+        <w:rPr>
+          <w:i/>
+          <w:iCs/>
+        </w:rPr>
+        <w:t>cyberbullying</w:t>
+      </w:r>
+      <w:r>
+        <w:t xml:space="preserve">, </w:t>
+      </w:r>
+      <w:r>
+        <w:rPr>
+          <w:i/>
+          <w:iCs/>
+        </w:rPr>
+        <w:t>grooming</w:t>
+      </w:r>
+      <w:r>
+        <w:t xml:space="preserve"> y redes sociales. </w:t>
+      </w:r>
+    </w:p>
+    <w:p>
+      <w:pPr>
+        <w:pStyle w:val="NormalWeb"/>
+        <w:numPr>
+          <w:ilvl w:val="0"/>
+          <w:numId w:val="17"/>
+        </w:numPr>
+      </w:pPr>
+      <w:r>
+        <w:rPr>
+          <w:b/>
+          <w:bCs/>
+        </w:rPr>
+        <w:t>Plataformas Virtuales:</w:t>
+      </w:r>
+      <w:r>
+        <w:t xml:space="preserve"> Interacción básica y segura en entonos de aprendizaje y redes escolares. </w:t>
+      </w:r>
+    </w:p>
+    <w:p>
+      <w:pPr>
+        <w:pStyle w:val="NormalWeb"/>
+        <w:numPr>
+          <w:ilvl w:val="0"/>
+          <w:numId w:val="17"/>
+        </w:numPr>
+      </w:pPr>
+      <w:r>
+        <w:rPr>
+          <w:b/>
+          <w:bCs/>
+        </w:rPr>
+        <w:t>Propiedad Intelectual y Licencias Digitales:</w:t>
+      </w:r>
+      <w:r>
+        <w:t xml:space="preserve"> Concepto de autoría, dominio público, derechos de autor y licencias </w:t>
+      </w:r>
+      <w:r>
+        <w:rPr>
+          <w:i/>
+          <w:iCs/>
+        </w:rPr>
+        <w:t>Creative Commons</w:t>
+      </w:r>
+      <w:r>
+        <w:t xml:space="preserve"> (CC). </w:t>
+      </w:r>
+    </w:p>
+    <w:p>
+      <w:pPr>
+        <w:pStyle w:val="Ttulo3"/>
+      </w:pPr>
+      <w:r>
+        <w:t>2. Secuenciación y Actividades (12 Sesiones)</w:t>
+      </w:r>
+    </w:p>
+    <w:p>
+      <w:pPr>
+        <w:pStyle w:val="Ttulo4"/>
+      </w:pPr>
+      <w:r>
+        <w:t>Sesión 1: Identidad Digital y Huella Digital</w:t>
+      </w:r>
+    </w:p>
+    <w:p>
+      <w:pPr>
+        <w:pStyle w:val="NormalWeb"/>
+        <w:numPr>
+          <w:ilvl w:val="0"/>
+          <w:numId w:val="18"/>
+        </w:numPr>
+      </w:pPr>
+      <w:r>
+        <w:rPr>
+          <w:b/>
+          <w:bCs/>
+        </w:rPr>
+        <w:t>Contenido:</w:t>
+      </w:r>
+      <w:r>
+        <w:t xml:space="preserve"> Exposición de los usuarios y presencia en la red. </w:t>
+      </w:r>
+    </w:p>
+    <w:p>
+      <w:pPr>
+        <w:pStyle w:val="NormalWeb"/>
+        <w:numPr>
+          <w:ilvl w:val="0"/>
+          <w:numId w:val="18"/>
+        </w:numPr>
+      </w:pPr>
+      <w:r>
+        <w:rPr>
+          <w:b/>
+          <w:bCs/>
+        </w:rPr>
+        <w:t>Actividad 1.1 ("Muro Digital"):</w:t>
+      </w:r>
+      <w:r>
+        <w:t xml:space="preserve"> Debate guiado sobre qué datos publican en red. Los alumnos buscan de forma simulada qué información es pública sobre un perfil ficticio e identifican riesgos.</w:t>
+      </w:r>
+    </w:p>
+    <w:p>
+      <w:pPr>
+        <w:pStyle w:val="Ttulo4"/>
+      </w:pPr>
+      <w:r>
+        <w:lastRenderedPageBreak/>
+        <w:t>Sesión 2: Peligros en la Red</w:t>
+      </w:r>
+    </w:p>
+    <w:p>
+      <w:pPr>
+        <w:pStyle w:val="NormalWeb"/>
+        <w:numPr>
+          <w:ilvl w:val="0"/>
+          <w:numId w:val="19"/>
+        </w:numPr>
+      </w:pPr>
+      <w:r>
+        <w:rPr>
+          <w:b/>
+          <w:bCs/>
+        </w:rPr>
+        <w:t>Contenido:</w:t>
+      </w:r>
+      <w:r>
+        <w:t xml:space="preserve"> </w:t>
+      </w:r>
+      <w:r>
+        <w:rPr>
+          <w:i/>
+          <w:iCs/>
+        </w:rPr>
+        <w:t>Phishing</w:t>
+      </w:r>
+      <w:r>
+        <w:t xml:space="preserve">, </w:t>
+      </w:r>
+      <w:r>
+        <w:rPr>
+          <w:i/>
+          <w:iCs/>
+        </w:rPr>
+        <w:t>malware</w:t>
+      </w:r>
+      <w:r>
+        <w:t xml:space="preserve">, suplantación e ingeniería social. </w:t>
+      </w:r>
+    </w:p>
+    <w:p>
+      <w:pPr>
+        <w:pStyle w:val="NormalWeb"/>
+        <w:numPr>
+          <w:ilvl w:val="0"/>
+          <w:numId w:val="19"/>
+        </w:numPr>
+      </w:pPr>
+      <w:r>
+        <w:rPr>
+          <w:b/>
+          <w:bCs/>
+        </w:rPr>
+        <w:t>Actividad 1.2 ("Detectives del Phishing"):</w:t>
+      </w:r>
+      <w:r>
+        <w:t xml:space="preserve"> Análisis en parejas de 5 correos electrónicos o mensajes reales/simulados para clasificar cuáles son intentos de fraude y señalar sus indicadores clave.</w:t>
+      </w:r>
+    </w:p>
+    <w:p>
+      <w:pPr>
+        <w:pStyle w:val="Ttulo4"/>
+      </w:pPr>
+      <w:r>
+        <w:t>Sesión 3: Seguridad Activa (I) – Contraseñas e Identidad</w:t>
+      </w:r>
+    </w:p>
+    <w:p>
+      <w:pPr>
+        <w:pStyle w:val="NormalWeb"/>
+        <w:numPr>
+          <w:ilvl w:val="0"/>
+          <w:numId w:val="20"/>
+        </w:numPr>
+      </w:pPr>
+      <w:r>
+        <w:rPr>
+          <w:b/>
+          <w:bCs/>
+        </w:rPr>
+        <w:t>Contenido:</w:t>
+      </w:r>
+      <w:r>
+        <w:t xml:space="preserve"> Estrategias de protección activa. </w:t>
+      </w:r>
+    </w:p>
+    <w:p>
+      <w:pPr>
+        <w:pStyle w:val="NormalWeb"/>
+        <w:numPr>
+          <w:ilvl w:val="0"/>
+          <w:numId w:val="20"/>
+        </w:numPr>
+      </w:pPr>
+      <w:r>
+        <w:rPr>
+          <w:b/>
+          <w:bCs/>
+        </w:rPr>
+        <w:t>Actividad 1.3 ("Taller de Claves Robustas"):</w:t>
+      </w:r>
+      <w:r>
+        <w:t xml:space="preserve"> Creación y comprobación con herramientas de verificación de la solidez de contraseñas mediante el uso de patrones, frases de paso y caracteres especiales sin usar datos personales.</w:t>
+      </w:r>
+    </w:p>
+    <w:p>
+      <w:pPr>
+        <w:pStyle w:val="Ttulo4"/>
+      </w:pPr>
+      <w:r>
+        <w:t>Sesión 4: Seguridad Activa (II) y Pasiva</w:t>
+      </w:r>
+    </w:p>
+    <w:p>
+      <w:pPr>
+        <w:pStyle w:val="NormalWeb"/>
+        <w:numPr>
+          <w:ilvl w:val="0"/>
+          <w:numId w:val="21"/>
+        </w:numPr>
+      </w:pPr>
+      <w:r>
+        <w:rPr>
+          <w:b/>
+          <w:bCs/>
+        </w:rPr>
+        <w:t>Contenido:</w:t>
+      </w:r>
+      <w:r>
+        <w:t xml:space="preserve"> Antivirus, actualizaciones, copias de seguridad e imágenes del sistema. </w:t>
+      </w:r>
+    </w:p>
+    <w:p>
+      <w:pPr>
+        <w:pStyle w:val="NormalWeb"/>
+        <w:numPr>
+          <w:ilvl w:val="0"/>
+          <w:numId w:val="21"/>
+        </w:numPr>
+      </w:pPr>
+      <w:r>
+        <w:rPr>
+          <w:b/>
+          <w:bCs/>
+        </w:rPr>
+        <w:t>Actividad 1.4 ("Plan de Respaldo"):</w:t>
+      </w:r>
+      <w:r>
+        <w:t xml:space="preserve"> Configuración paso a paso de una rutina de copias de seguridad en la nube del centro/unidad local y verificación de puntos de restauración.</w:t>
+      </w:r>
+    </w:p>
+    <w:p>
+      <w:pPr>
+        <w:pStyle w:val="Ttulo4"/>
+      </w:pPr>
+      <w:r>
+        <w:t>Sesiones 5 y 6: Uso Seguro de Plataformas Virtuales</w:t>
+      </w:r>
+    </w:p>
+    <w:p>
+      <w:pPr>
+        <w:pStyle w:val="NormalWeb"/>
+        <w:numPr>
+          <w:ilvl w:val="0"/>
+          <w:numId w:val="22"/>
+        </w:numPr>
+      </w:pPr>
+      <w:r>
+        <w:rPr>
+          <w:b/>
+          <w:bCs/>
+        </w:rPr>
+        <w:t>Contenido:</w:t>
+      </w:r>
+      <w:r>
+        <w:t xml:space="preserve"> Interacción básica en plataformas virtuales escolares y foros. </w:t>
+      </w:r>
+    </w:p>
+    <w:p>
+      <w:pPr>
+        <w:pStyle w:val="NormalWeb"/>
+        <w:numPr>
+          <w:ilvl w:val="0"/>
+          <w:numId w:val="22"/>
+        </w:numPr>
+      </w:pPr>
+      <w:r>
+        <w:rPr>
+          <w:b/>
+          <w:bCs/>
+        </w:rPr>
+        <w:t>Actividad 1.5 ("Netiqueta y Entorno Virtual"):</w:t>
+      </w:r>
+      <w:r>
+        <w:t xml:space="preserve"> Configuración de la privacidad del perfil escolar, prueba de comunicación en foros internos aplicando reglas de convivencia (</w:t>
+      </w:r>
+      <w:r>
+        <w:rPr>
+          <w:i/>
+          <w:iCs/>
+        </w:rPr>
+        <w:t>netiqueta</w:t>
+      </w:r>
+      <w:r>
+        <w:t xml:space="preserve">) y gestión de la entrega de tareas. </w:t>
+      </w:r>
+    </w:p>
+    <w:p>
+      <w:pPr>
+        <w:pStyle w:val="Ttulo4"/>
+      </w:pPr>
+      <w:r>
+        <w:t>Sesión 7: Propiedad Intelectual y Derechos de Autor</w:t>
+      </w:r>
+    </w:p>
+    <w:p>
+      <w:pPr>
+        <w:pStyle w:val="NormalWeb"/>
+        <w:numPr>
+          <w:ilvl w:val="0"/>
+          <w:numId w:val="23"/>
+        </w:numPr>
+      </w:pPr>
+      <w:r>
+        <w:rPr>
+          <w:b/>
+          <w:bCs/>
+        </w:rPr>
+        <w:t>Contenido:</w:t>
+      </w:r>
+      <w:r>
+        <w:t xml:space="preserve"> Conceptos básicos de propiedad intelectual y tipos de licencias. </w:t>
+      </w:r>
+    </w:p>
+    <w:p>
+      <w:pPr>
+        <w:pStyle w:val="NormalWeb"/>
+        <w:numPr>
+          <w:ilvl w:val="0"/>
+          <w:numId w:val="23"/>
+        </w:numPr>
+      </w:pPr>
+      <w:r>
+        <w:rPr>
+          <w:b/>
+          <w:bCs/>
+        </w:rPr>
+        <w:t>Actividad 1.6 ("Infracción o Respeto"):</w:t>
+      </w:r>
+      <w:r>
+        <w:t xml:space="preserve"> Caso práctico en el que los alumnos clasifican distintos escenarios (descargar imágenes de Google, usar música comercial en vídeos, etc.) según su legalidad. </w:t>
+      </w:r>
+    </w:p>
+    <w:p>
+      <w:pPr>
+        <w:pStyle w:val="Ttulo4"/>
+      </w:pPr>
+      <w:r>
+        <w:t>Sesión 8: Licencias Libres y Creative Commons</w:t>
+      </w:r>
+    </w:p>
+    <w:p>
+      <w:pPr>
+        <w:pStyle w:val="NormalWeb"/>
+        <w:numPr>
+          <w:ilvl w:val="0"/>
+          <w:numId w:val="24"/>
+        </w:numPr>
+      </w:pPr>
+      <w:r>
+        <w:rPr>
+          <w:b/>
+          <w:bCs/>
+        </w:rPr>
+        <w:t>Contenido:</w:t>
+      </w:r>
+      <w:r>
+        <w:t xml:space="preserve"> Tipos de licencias </w:t>
+      </w:r>
+      <w:r>
+        <w:rPr>
+          <w:i/>
+          <w:iCs/>
+        </w:rPr>
+        <w:t>Creative Commons</w:t>
+      </w:r>
+      <w:r>
+        <w:t xml:space="preserve"> (BY, NC, SA, ND) y repositorios abiertos. </w:t>
+      </w:r>
+    </w:p>
+    <w:p>
+      <w:pPr>
+        <w:pStyle w:val="NormalWeb"/>
+        <w:numPr>
+          <w:ilvl w:val="0"/>
+          <w:numId w:val="24"/>
+        </w:numPr>
+      </w:pPr>
+      <w:r>
+        <w:rPr>
+          <w:b/>
+          <w:bCs/>
+        </w:rPr>
+        <w:t>Actividad 1.7 ("Búsqueda Licenciada"):</w:t>
+      </w:r>
+      <w:r>
+        <w:t xml:space="preserve"> Búsqueda de recursos multimedia en bancos de imágenes y audio libres (Wikimedia Commons, Jamendo) identificando la cita correcta del autor en cada tipo de licencia. </w:t>
+      </w:r>
+    </w:p>
+    <w:p>
+      <w:pPr>
+        <w:pStyle w:val="Ttulo4"/>
+      </w:pPr>
+      <w:r>
+        <w:t>Sesiones 9, 10 y 11: Proyecto Práctico – Decálogo de Ciberseguridad</w:t>
+      </w:r>
+    </w:p>
+    <w:p>
+      <w:pPr>
+        <w:pStyle w:val="NormalWeb"/>
+        <w:numPr>
+          <w:ilvl w:val="0"/>
+          <w:numId w:val="25"/>
+        </w:numPr>
+      </w:pPr>
+      <w:r>
+        <w:rPr>
+          <w:b/>
+          <w:bCs/>
+        </w:rPr>
+        <w:t>Contenido:</w:t>
+      </w:r>
+      <w:r>
+        <w:t xml:space="preserve"> Integración de los contenidos del bloque. </w:t>
+      </w:r>
+    </w:p>
+    <w:p>
+      <w:pPr>
+        <w:pStyle w:val="NormalWeb"/>
+        <w:numPr>
+          <w:ilvl w:val="0"/>
+          <w:numId w:val="25"/>
+        </w:numPr>
+      </w:pPr>
+      <w:r>
+        <w:rPr>
+          <w:b/>
+          <w:bCs/>
+        </w:rPr>
+        <w:t>Actividad 1.8 (Producto Final - Criterios 6.1, 6.2, 6.3, 6.4):</w:t>
+      </w:r>
+      <w:r>
+        <w:t xml:space="preserve"> Elaboración por equipos de una guía/infografía interactiva sobre ciberseguridad y uso ético de la </w:t>
+      </w:r>
+      <w:r>
+        <w:lastRenderedPageBreak/>
+        <w:t xml:space="preserve">red utilizando solo imágenes con licencias abiertas y citando las fuentes correctamente. </w:t>
+      </w:r>
+    </w:p>
+    <w:p>
+      <w:pPr>
+        <w:pStyle w:val="Ttulo4"/>
+      </w:pPr>
+      <w:r>
+        <w:t>Sesión 12: Exposición y Evaluación</w:t>
+      </w:r>
+    </w:p>
+    <w:p>
+      <w:pPr>
+        <w:pStyle w:val="NormalWeb"/>
+        <w:numPr>
+          <w:ilvl w:val="0"/>
+          <w:numId w:val="26"/>
+        </w:numPr>
+      </w:pPr>
+      <w:r>
+        <w:rPr>
+          <w:b/>
+          <w:bCs/>
+        </w:rPr>
+        <w:t>Actividad 1.9:</w:t>
+      </w:r>
+      <w:r>
+        <w:t xml:space="preserve"> Coevaluación y autoevaluación del proyecto mediante rúbrica interactiva centrada en la adopción de conductas seguras y el respeto a la propiedad intelectual. </w:t>
+      </w:r>
+    </w:p>
+    <w:p>
+      <w:pPr>
+        <w:pStyle w:val="Ttulo2"/>
+      </w:pPr>
+      <w:r>
+        <w:t>UNIDAD DIDÁCTICA 2: Pensamiento Computacional y Lógica de Programación por Bloques</w:t>
+      </w:r>
+    </w:p>
+    <w:p>
+      <w:pPr>
+        <w:pStyle w:val="NormalWeb"/>
+        <w:numPr>
+          <w:ilvl w:val="0"/>
+          <w:numId w:val="27"/>
+        </w:numPr>
+      </w:pPr>
+      <w:r>
+        <w:rPr>
+          <w:b/>
+          <w:bCs/>
+        </w:rPr>
+        <w:t>Duración:</w:t>
+      </w:r>
+      <w:r>
+        <w:t xml:space="preserve"> 1.º Trimestre (Semanas 7 a 12) – 12 sesiones aprox.</w:t>
+      </w:r>
+    </w:p>
+    <w:p>
+      <w:pPr>
+        <w:pStyle w:val="NormalWeb"/>
+        <w:numPr>
+          <w:ilvl w:val="0"/>
+          <w:numId w:val="27"/>
+        </w:numPr>
+      </w:pPr>
+      <w:r>
+        <w:rPr>
+          <w:b/>
+          <w:bCs/>
+        </w:rPr>
+        <w:t>Bloque de Saberes:</w:t>
+      </w:r>
+      <w:r>
+        <w:t xml:space="preserve"> </w:t>
+      </w:r>
+      <w:r>
+        <w:rPr>
+          <w:b/>
+          <w:bCs/>
+        </w:rPr>
+        <w:t>Bloque A: Introducción a la Programación</w:t>
+      </w:r>
+      <w:r>
+        <w:t xml:space="preserve"> (CYR.1.A.1, CYR.1.A.2, CYR.1.A.3, CYR.1.A.4, CYR.1.A.5). </w:t>
+      </w:r>
+    </w:p>
+    <w:p>
+      <w:pPr>
+        <w:pStyle w:val="NormalWeb"/>
+        <w:numPr>
+          <w:ilvl w:val="0"/>
+          <w:numId w:val="27"/>
+        </w:numPr>
+      </w:pPr>
+      <w:r>
+        <w:rPr>
+          <w:b/>
+          <w:bCs/>
+        </w:rPr>
+        <w:t>Criterios de Evaluación:</w:t>
+      </w:r>
+      <w:r>
+        <w:t xml:space="preserve"> </w:t>
+      </w:r>
+      <w:r>
+        <w:rPr>
+          <w:b/>
+          <w:bCs/>
+        </w:rPr>
+        <w:t>1.3, 2.1</w:t>
+      </w:r>
+      <w:r>
+        <w:t xml:space="preserve">. </w:t>
+      </w:r>
+    </w:p>
+    <w:p>
+      <w:pPr>
+        <w:pStyle w:val="Ttulo3"/>
+      </w:pPr>
+      <w:r>
+        <w:t>1. Detalle de Contenidos</w:t>
+      </w:r>
+    </w:p>
+    <w:p>
+      <w:pPr>
+        <w:pStyle w:val="NormalWeb"/>
+        <w:numPr>
+          <w:ilvl w:val="0"/>
+          <w:numId w:val="28"/>
+        </w:numPr>
+      </w:pPr>
+      <w:r>
+        <w:rPr>
+          <w:b/>
+          <w:bCs/>
+        </w:rPr>
+        <w:t>Entornos y Lenguajes Visuales:</w:t>
+      </w:r>
+      <w:r>
+        <w:t xml:space="preserve"> Entornos de programación por bloques (Scratch, MakeCode, etc.) y tipos de entornos visuales. </w:t>
+      </w:r>
+    </w:p>
+    <w:p>
+      <w:pPr>
+        <w:pStyle w:val="NormalWeb"/>
+        <w:numPr>
+          <w:ilvl w:val="0"/>
+          <w:numId w:val="28"/>
+        </w:numPr>
+      </w:pPr>
+      <w:r>
+        <w:rPr>
+          <w:b/>
+          <w:bCs/>
+        </w:rPr>
+        <w:t>Pensamiento Computacional y Algoritmos:</w:t>
+      </w:r>
+      <w:r>
+        <w:t xml:space="preserve"> Concepto de algoritmo, diseño de diagramas sencillos y secuenciación de instrucciones. </w:t>
+      </w:r>
+    </w:p>
+    <w:p>
+      <w:pPr>
+        <w:pStyle w:val="NormalWeb"/>
+        <w:numPr>
+          <w:ilvl w:val="0"/>
+          <w:numId w:val="28"/>
+        </w:numPr>
+      </w:pPr>
+      <w:r>
+        <w:rPr>
+          <w:b/>
+          <w:bCs/>
+        </w:rPr>
+        <w:t>Estructuras de Control:</w:t>
+      </w:r>
+      <w:r>
+        <w:t xml:space="preserve"> Detección y aplicación de tareas repetitivas (bucles) y condicionales (si... entonces / si... no). </w:t>
+      </w:r>
+    </w:p>
+    <w:p>
+      <w:pPr>
+        <w:pStyle w:val="NormalWeb"/>
+        <w:numPr>
+          <w:ilvl w:val="0"/>
+          <w:numId w:val="28"/>
+        </w:numPr>
+      </w:pPr>
+      <w:r>
+        <w:rPr>
+          <w:b/>
+          <w:bCs/>
+        </w:rPr>
+        <w:t>Interacción con el Usuario:</w:t>
+      </w:r>
+      <w:r>
+        <w:t xml:space="preserve"> Entradas por teclado/ratón, salidas por pantalla y gestión de eventos. </w:t>
+      </w:r>
+    </w:p>
+    <w:p>
+      <w:pPr>
+        <w:pStyle w:val="Ttulo3"/>
+      </w:pPr>
+      <w:r>
+        <w:t>2. Secuenciación y Actividades (12 Sesiones)</w:t>
+      </w:r>
+    </w:p>
+    <w:p>
+      <w:pPr>
+        <w:pStyle w:val="Ttulo4"/>
+      </w:pPr>
+      <w:r>
+        <w:t>Sesión 1: Algoritmos fuera de la máquina (Unplugged)</w:t>
+      </w:r>
+    </w:p>
+    <w:p>
+      <w:pPr>
+        <w:pStyle w:val="NormalWeb"/>
+        <w:numPr>
+          <w:ilvl w:val="0"/>
+          <w:numId w:val="29"/>
+        </w:numPr>
+      </w:pPr>
+      <w:r>
+        <w:rPr>
+          <w:b/>
+          <w:bCs/>
+        </w:rPr>
+        <w:t>Contenido:</w:t>
+      </w:r>
+      <w:r>
+        <w:t xml:space="preserve"> Concepto de algoritmo y secuencia básica de instrucciones. </w:t>
+      </w:r>
+    </w:p>
+    <w:p>
+      <w:pPr>
+        <w:pStyle w:val="NormalWeb"/>
+        <w:numPr>
+          <w:ilvl w:val="0"/>
+          <w:numId w:val="29"/>
+        </w:numPr>
+      </w:pPr>
+      <w:r>
+        <w:rPr>
+          <w:b/>
+          <w:bCs/>
+        </w:rPr>
+        <w:t>Actividad 2.1 ("El Robot Humano"):</w:t>
+      </w:r>
+      <w:r>
+        <w:t xml:space="preserve"> Un alumno interpreta a un "robot" y debe seguir las instrucciones escritas por sus compañeros para realizar una tarea cotidiana (ej. preparar una mochila), identificando errores de ambigüedad (</w:t>
+      </w:r>
+      <w:r>
+        <w:rPr>
+          <w:i/>
+          <w:iCs/>
+        </w:rPr>
+        <w:t>bugs</w:t>
+      </w:r>
+      <w:r>
+        <w:t>).</w:t>
+      </w:r>
+    </w:p>
+    <w:p>
+      <w:pPr>
+        <w:pStyle w:val="Ttulo4"/>
+      </w:pPr>
+      <w:r>
+        <w:t>Sesión 2: Introducción al Entorno de Bloques</w:t>
+      </w:r>
+    </w:p>
+    <w:p>
+      <w:pPr>
+        <w:pStyle w:val="NormalWeb"/>
+        <w:numPr>
+          <w:ilvl w:val="0"/>
+          <w:numId w:val="30"/>
+        </w:numPr>
+      </w:pPr>
+      <w:r>
+        <w:rPr>
+          <w:b/>
+          <w:bCs/>
+        </w:rPr>
+        <w:t>Contenido:</w:t>
+      </w:r>
+      <w:r>
+        <w:t xml:space="preserve"> Interfaz del IDE por bloques, escenarios, objetos y bloques de movimiento/apariencia. </w:t>
+      </w:r>
+    </w:p>
+    <w:p>
+      <w:pPr>
+        <w:pStyle w:val="NormalWeb"/>
+        <w:numPr>
+          <w:ilvl w:val="0"/>
+          <w:numId w:val="30"/>
+        </w:numPr>
+      </w:pPr>
+      <w:r>
+        <w:rPr>
+          <w:b/>
+          <w:bCs/>
+        </w:rPr>
+        <w:t>Actividad 2.2 ("Primeros Pasos"):</w:t>
+      </w:r>
+      <w:r>
+        <w:t xml:space="preserve"> Creación de un proyecto básico donde un personaje se desplaza por la pantalla, cambia de disfraz y emite un mensaje de bienvenida. </w:t>
+      </w:r>
+    </w:p>
+    <w:p>
+      <w:pPr>
+        <w:pStyle w:val="Ttulo4"/>
+      </w:pPr>
+      <w:r>
+        <w:t>Sesiones 3 y 4: Secuenciación y Coordinación de Eventos</w:t>
+      </w:r>
+    </w:p>
+    <w:p>
+      <w:pPr>
+        <w:pStyle w:val="NormalWeb"/>
+        <w:numPr>
+          <w:ilvl w:val="0"/>
+          <w:numId w:val="31"/>
+        </w:numPr>
+      </w:pPr>
+      <w:r>
+        <w:rPr>
+          <w:b/>
+          <w:bCs/>
+        </w:rPr>
+        <w:lastRenderedPageBreak/>
+        <w:t>Contenido:</w:t>
+      </w:r>
+      <w:r>
+        <w:t xml:space="preserve"> Eventos de inicio (al hacer clic, al pulsar tecla) e interacción con el usuario. </w:t>
+      </w:r>
+    </w:p>
+    <w:p>
+      <w:pPr>
+        <w:pStyle w:val="NormalWeb"/>
+        <w:numPr>
+          <w:ilvl w:val="0"/>
+          <w:numId w:val="31"/>
+        </w:numPr>
+      </w:pPr>
+      <w:r>
+        <w:rPr>
+          <w:b/>
+          <w:bCs/>
+        </w:rPr>
+        <w:t>Actividad 2.3 ("Diálogo Interactivo"):</w:t>
+      </w:r>
+      <w:r>
+        <w:t xml:space="preserve"> Programación de una conversación entre dos personajes utilizando la emisión y recepción de mensajes para sincronizar los tiempos de intervención. </w:t>
+      </w:r>
+    </w:p>
+    <w:p>
+      <w:pPr>
+        <w:pStyle w:val="Ttulo4"/>
+      </w:pPr>
+      <w:r>
+        <w:t>Sesiones 5 y 6: Bucles y Tareas Repetitivas</w:t>
+      </w:r>
+    </w:p>
+    <w:p>
+      <w:pPr>
+        <w:pStyle w:val="NormalWeb"/>
+        <w:numPr>
+          <w:ilvl w:val="0"/>
+          <w:numId w:val="32"/>
+        </w:numPr>
+      </w:pPr>
+      <w:r>
+        <w:rPr>
+          <w:b/>
+          <w:bCs/>
+        </w:rPr>
+        <w:t>Contenido:</w:t>
+      </w:r>
+      <w:r>
+        <w:t xml:space="preserve"> Bucle repetitivo fijado y bucle por siempre. </w:t>
+      </w:r>
+    </w:p>
+    <w:p>
+      <w:pPr>
+        <w:pStyle w:val="NormalWeb"/>
+        <w:numPr>
+          <w:ilvl w:val="0"/>
+          <w:numId w:val="32"/>
+        </w:numPr>
+      </w:pPr>
+      <w:r>
+        <w:rPr>
+          <w:b/>
+          <w:bCs/>
+        </w:rPr>
+        <w:t>Actividad 2.4 ("Geometría Algorítmica"):</w:t>
+      </w:r>
+      <w:r>
+        <w:t xml:space="preserve"> Utilización del módulo de lápiz para programar un dibujo automatizado de figuras geométricas (cuadrado, triángulo, círculo) optimizando el código mediante bucles. </w:t>
+      </w:r>
+    </w:p>
+    <w:p>
+      <w:pPr>
+        <w:pStyle w:val="Ttulo4"/>
+      </w:pPr>
+      <w:r>
+        <w:t>Sesiones 7 y 8: Condicionales y Sensores</w:t>
+      </w:r>
+    </w:p>
+    <w:p>
+      <w:pPr>
+        <w:pStyle w:val="NormalWeb"/>
+        <w:numPr>
+          <w:ilvl w:val="0"/>
+          <w:numId w:val="33"/>
+        </w:numPr>
+      </w:pPr>
+      <w:r>
+        <w:rPr>
+          <w:b/>
+          <w:bCs/>
+        </w:rPr>
+        <w:t>Contenido:</w:t>
+      </w:r>
+      <w:r>
+        <w:t xml:space="preserve"> Condicionales sencillos y compuestos, detección de colisiones e interacción por teclado. </w:t>
+      </w:r>
+    </w:p>
+    <w:p>
+      <w:pPr>
+        <w:pStyle w:val="NormalWeb"/>
+        <w:numPr>
+          <w:ilvl w:val="0"/>
+          <w:numId w:val="33"/>
+        </w:numPr>
+      </w:pPr>
+      <w:r>
+        <w:rPr>
+          <w:b/>
+          <w:bCs/>
+        </w:rPr>
+        <w:t>Actividad 2.5 ("Navegando el Laberinto"):</w:t>
+      </w:r>
+      <w:r>
+        <w:t xml:space="preserve"> Diseño de un juego donde el personaje se mueve con las flechas del teclado y reaccciona de forma distinta si toca una pared (condicional + sensor de color) o si llega al objetivo. </w:t>
+      </w:r>
+    </w:p>
+    <w:p>
+      <w:pPr>
+        <w:pStyle w:val="Ttulo4"/>
+      </w:pPr>
+      <w:r>
+        <w:t>Sesiones 9, 10 y 11: Proyecto Práctico – Desarrollo de un Videojuego o Historia Interactiva</w:t>
+      </w:r>
+    </w:p>
+    <w:p>
+      <w:pPr>
+        <w:pStyle w:val="NormalWeb"/>
+        <w:numPr>
+          <w:ilvl w:val="0"/>
+          <w:numId w:val="34"/>
+        </w:numPr>
+      </w:pPr>
+      <w:r>
+        <w:rPr>
+          <w:b/>
+          <w:bCs/>
+        </w:rPr>
+        <w:t>Contenido:</w:t>
+      </w:r>
+      <w:r>
+        <w:t xml:space="preserve"> Integración de secuencias, bucles, condicionales e interacción. </w:t>
+      </w:r>
+    </w:p>
+    <w:p>
+      <w:pPr>
+        <w:pStyle w:val="NormalWeb"/>
+        <w:numPr>
+          <w:ilvl w:val="0"/>
+          <w:numId w:val="34"/>
+        </w:numPr>
+      </w:pPr>
+      <w:r>
+        <w:rPr>
+          <w:b/>
+          <w:bCs/>
+        </w:rPr>
+        <w:t>Actividad 2.6 (Producto Final - Criterios 1.3, 2.1):</w:t>
+      </w:r>
+      <w:r>
+        <w:t xml:space="preserve"> Trabajo cooperativo por parejas para diseñar y programar un proyecto que resuelva un problema planteado (ej. un juego educativo de reciclaje) combinando entrada de usuario, toma de decisiones y respuestas visuales. </w:t>
+      </w:r>
+    </w:p>
+    <w:p>
+      <w:pPr>
+        <w:pStyle w:val="Ttulo4"/>
+      </w:pPr>
+      <w:r>
+        <w:t>Sesión 12: Depuración y Presentación</w:t>
+      </w:r>
+    </w:p>
+    <w:p>
+      <w:pPr>
+        <w:pStyle w:val="NormalWeb"/>
+        <w:numPr>
+          <w:ilvl w:val="0"/>
+          <w:numId w:val="35"/>
+        </w:numPr>
+      </w:pPr>
+      <w:r>
+        <w:rPr>
+          <w:b/>
+          <w:bCs/>
+        </w:rPr>
+        <w:t>Actividad 2.7:</w:t>
+      </w:r>
+      <w:r>
+        <w:t xml:space="preserve"> Prueba cruzada entre equipos para la localización y corrección de errores de programación (</w:t>
+      </w:r>
+      <w:r>
+        <w:rPr>
+          <w:i/>
+          <w:iCs/>
+        </w:rPr>
+        <w:t>debugging</w:t>
+      </w:r>
+      <w:r>
+        <w:t xml:space="preserve">), seguida de la presentación del producto final a la clase. </w:t>
+      </w:r>
+    </w:p>
+    <w:p>
+      <w:pPr>
         <w:spacing w:before="100" w:beforeAutospacing="1" w:after="100" w:afterAutospacing="1" w:line="240" w:lineRule="auto"/>
         <w:rPr>
           <w:rFonts w:ascii="Times New Roman" w:eastAsia="Times New Roman" w:hAnsi="Times New Roman" w:cs="Times New Roman"/>
@@ -4942,155 +6110,6 @@
 <file path=word/numbering.xml><?xml version="1.0" encoding="utf-8"?>
 <w:numbering xmlns:wpc="http://schemas.microsoft.com/office/word/2010/wordprocessingCanvas" xmlns:cx="http://schemas.microsoft.com/office/drawing/2014/chartex" xmlns:mc="http://schemas.openxmlformats.org/markup-compatibility/2006" xmlns:o="urn:schemas-microsoft-com:office:office" xmlns:r="http://schemas.openxmlformats.org/officeDocument/2006/relationships" xmlns:m="http://schemas.openxmlformats.org/officeDocument/2006/math" xmlns:v="urn:schemas-microsoft-com:vml" xmlns:wp14="http://schemas.microsoft.com/office/word/2010/wordprocessingDrawing" xmlns:wp="http://schemas.openxmlformats.org/drawingml/2006/wordprocessingDrawing" xmlns:w10="urn:schemas-microsoft-com:office:word" xmlns:w="http://schemas.openxmlformats.org/wordprocessingml/2006/main" xmlns:w14="http://schemas.microsoft.com/office/word/2010/wordml" xmlns:w15="http://schemas.microsoft.com/office/word/2012/wordml" xmlns:w16se="http://schemas.microsoft.com/office/word/2015/wordml/symex" xmlns:wpg="http://schemas.microsoft.com/office/word/2010/wordprocessingGroup" xmlns:wpi="http://schemas.microsoft.com/office/word/2010/wordprocessingInk" xmlns:wne="http://schemas.microsoft.com/office/word/2006/wordml" xmlns:wps="http://schemas.microsoft.com/office/word/2010/wordprocessingShape" mc:Ignorable="w14 w15 w16se wp14">
   <w:abstractNum w:abstractNumId="0" w15:restartNumberingAfterBreak="0">
-    <w:nsid w:val="011235DA"/>
-    <w:multiLevelType w:val="multilevel"/>
-    <w:tmpl w:val="5A12F06A"/>
-    <w:lvl w:ilvl="0">
-      <w:start w:val="1"/>
-      <w:numFmt w:val="bullet"/>
-      <w:lvlText w:val=""/>
-      <w:lvlJc w:val="left"/>
-      <w:pPr>
-        <w:tabs>
-          <w:tab w:val="num" w:pos="720"/>
-        </w:tabs>
-        <w:ind w:left="720" w:hanging="360"/>
-      </w:pPr>
-      <w:rPr>
-        <w:rFonts w:ascii="Symbol" w:hAnsi="Symbol" w:hint="default"/>
-        <w:sz w:val="20"/>
-      </w:rPr>
-    </w:lvl>
-    <w:lvl w:ilvl="1">
-      <w:start w:val="1"/>
-      <w:numFmt w:val="bullet"/>
-      <w:lvlText w:val="o"/>
-      <w:lvlJc w:val="left"/>
-      <w:pPr>
-        <w:tabs>
-          <w:tab w:val="num" w:pos="1440"/>
-        </w:tabs>
-        <w:ind w:left="1440" w:hanging="360"/>
-      </w:pPr>
-      <w:rPr>
-        <w:rFonts w:ascii="Courier New" w:hAnsi="Courier New" w:hint="default"/>
-        <w:sz w:val="20"/>
-      </w:rPr>
-    </w:lvl>
-    <w:lvl w:ilvl="2" w:tentative="1">
-      <w:start w:val="1"/>
-      <w:numFmt w:val="bullet"/>
-      <w:lvlText w:val=""/>
-      <w:lvlJc w:val="left"/>
-      <w:pPr>
-        <w:tabs>
-          <w:tab w:val="num" w:pos="2160"/>
-        </w:tabs>
-        <w:ind w:left="2160" w:hanging="360"/>
-      </w:pPr>
-      <w:rPr>
-        <w:rFonts w:ascii="Wingdings" w:hAnsi="Wingdings" w:hint="default"/>
-        <w:sz w:val="20"/>
-      </w:rPr>
-    </w:lvl>
-    <w:lvl w:ilvl="3" w:tentative="1">
-      <w:start w:val="1"/>
-      <w:numFmt w:val="bullet"/>
-      <w:lvlText w:val=""/>
-      <w:lvlJc w:val="left"/>
-      <w:pPr>
-        <w:tabs>
-          <w:tab w:val="num" w:pos="2880"/>
-        </w:tabs>
-        <w:ind w:left="2880" w:hanging="360"/>
-      </w:pPr>
-      <w:rPr>
-        <w:rFonts w:ascii="Wingdings" w:hAnsi="Wingdings" w:hint="default"/>
-        <w:sz w:val="20"/>
-      </w:rPr>
-    </w:lvl>
-    <w:lvl w:ilvl="4" w:tentative="1">
-      <w:start w:val="1"/>
-      <w:numFmt w:val="bullet"/>
-      <w:lvlText w:val=""/>
-      <w:lvlJc w:val="left"/>
-      <w:pPr>
-        <w:tabs>
-          <w:tab w:val="num" w:pos="3600"/>
-        </w:tabs>
-        <w:ind w:left="3600" w:hanging="360"/>
-      </w:pPr>
-      <w:rPr>
-        <w:rFonts w:ascii="Wingdings" w:hAnsi="Wingdings" w:hint="default"/>
-        <w:sz w:val="20"/>
-      </w:rPr>
-    </w:lvl>
-    <w:lvl w:ilvl="5" w:tentative="1">
-      <w:start w:val="1"/>
-      <w:numFmt w:val="bullet"/>
-      <w:lvlText w:val=""/>
-      <w:lvlJc w:val="left"/>
-      <w:pPr>
-        <w:tabs>
-          <w:tab w:val="num" w:pos="4320"/>
-        </w:tabs>
-        <w:ind w:left="4320" w:hanging="360"/>
-      </w:pPr>
-      <w:rPr>
-        <w:rFonts w:ascii="Wingdings" w:hAnsi="Wingdings" w:hint="default"/>
-        <w:sz w:val="20"/>
-      </w:rPr>
-    </w:lvl>
-    <w:lvl w:ilvl="6" w:tentative="1">
-      <w:start w:val="1"/>
-      <w:numFmt w:val="bullet"/>
-      <w:lvlText w:val=""/>
-      <w:lvlJc w:val="left"/>
-      <w:pPr>
-        <w:tabs>
-          <w:tab w:val="num" w:pos="5040"/>
-        </w:tabs>
-        <w:ind w:left="5040" w:hanging="360"/>
-      </w:pPr>
-      <w:rPr>
-        <w:rFonts w:ascii="Wingdings" w:hAnsi="Wingdings" w:hint="default"/>
-        <w:sz w:val="20"/>
-      </w:rPr>
-    </w:lvl>
-    <w:lvl w:ilvl="7" w:tentative="1">
-      <w:start w:val="1"/>
-      <w:numFmt w:val="bullet"/>
-      <w:lvlText w:val=""/>
-      <w:lvlJc w:val="left"/>
-      <w:pPr>
-        <w:tabs>
-          <w:tab w:val="num" w:pos="5760"/>
-        </w:tabs>
-        <w:ind w:left="5760" w:hanging="360"/>
-      </w:pPr>
-      <w:rPr>
-        <w:rFonts w:ascii="Wingdings" w:hAnsi="Wingdings" w:hint="default"/>
-        <w:sz w:val="20"/>
-      </w:rPr>
-    </w:lvl>
-    <w:lvl w:ilvl="8" w:tentative="1">
-      <w:start w:val="1"/>
-      <w:numFmt w:val="bullet"/>
-      <w:lvlText w:val=""/>
-      <w:lvlJc w:val="left"/>
-      <w:pPr>
-        <w:tabs>
-          <w:tab w:val="num" w:pos="6480"/>
-        </w:tabs>
-        <w:ind w:left="6480" w:hanging="360"/>
-      </w:pPr>
-      <w:rPr>
-        <w:rFonts w:ascii="Wingdings" w:hAnsi="Wingdings" w:hint="default"/>
-        <w:sz w:val="20"/>
-      </w:rPr>
-    </w:lvl>
-  </w:abstractNum>
-  <w:abstractNum w:abstractNumId="1" w15:restartNumberingAfterBreak="0">
     <w:nsid w:val="03550B66"/>
     <w:multiLevelType w:val="multilevel"/>
     <w:tmpl w:val="E34A2FC0"/>
@@ -5239,10 +6258,159 @@
       </w:rPr>
     </w:lvl>
   </w:abstractNum>
+  <w:abstractNum w:abstractNumId="1" w15:restartNumberingAfterBreak="0">
+    <w:nsid w:val="05A00146"/>
+    <w:multiLevelType w:val="multilevel"/>
+    <w:tmpl w:val="228488A8"/>
+    <w:lvl w:ilvl="0">
+      <w:start w:val="1"/>
+      <w:numFmt w:val="bullet"/>
+      <w:lvlText w:val=""/>
+      <w:lvlJc w:val="left"/>
+      <w:pPr>
+        <w:tabs>
+          <w:tab w:val="num" w:pos="720"/>
+        </w:tabs>
+        <w:ind w:left="720" w:hanging="360"/>
+      </w:pPr>
+      <w:rPr>
+        <w:rFonts w:ascii="Symbol" w:hAnsi="Symbol" w:hint="default"/>
+        <w:sz w:val="20"/>
+      </w:rPr>
+    </w:lvl>
+    <w:lvl w:ilvl="1" w:tentative="1">
+      <w:start w:val="1"/>
+      <w:numFmt w:val="bullet"/>
+      <w:lvlText w:val="o"/>
+      <w:lvlJc w:val="left"/>
+      <w:pPr>
+        <w:tabs>
+          <w:tab w:val="num" w:pos="1440"/>
+        </w:tabs>
+        <w:ind w:left="1440" w:hanging="360"/>
+      </w:pPr>
+      <w:rPr>
+        <w:rFonts w:ascii="Courier New" w:hAnsi="Courier New" w:hint="default"/>
+        <w:sz w:val="20"/>
+      </w:rPr>
+    </w:lvl>
+    <w:lvl w:ilvl="2" w:tentative="1">
+      <w:start w:val="1"/>
+      <w:numFmt w:val="bullet"/>
+      <w:lvlText w:val=""/>
+      <w:lvlJc w:val="left"/>
+      <w:pPr>
+        <w:tabs>
+          <w:tab w:val="num" w:pos="2160"/>
+        </w:tabs>
+        <w:ind w:left="2160" w:hanging="360"/>
+      </w:pPr>
+      <w:rPr>
+        <w:rFonts w:ascii="Wingdings" w:hAnsi="Wingdings" w:hint="default"/>
+        <w:sz w:val="20"/>
+      </w:rPr>
+    </w:lvl>
+    <w:lvl w:ilvl="3" w:tentative="1">
+      <w:start w:val="1"/>
+      <w:numFmt w:val="bullet"/>
+      <w:lvlText w:val=""/>
+      <w:lvlJc w:val="left"/>
+      <w:pPr>
+        <w:tabs>
+          <w:tab w:val="num" w:pos="2880"/>
+        </w:tabs>
+        <w:ind w:left="2880" w:hanging="360"/>
+      </w:pPr>
+      <w:rPr>
+        <w:rFonts w:ascii="Wingdings" w:hAnsi="Wingdings" w:hint="default"/>
+        <w:sz w:val="20"/>
+      </w:rPr>
+    </w:lvl>
+    <w:lvl w:ilvl="4" w:tentative="1">
+      <w:start w:val="1"/>
+      <w:numFmt w:val="bullet"/>
+      <w:lvlText w:val=""/>
+      <w:lvlJc w:val="left"/>
+      <w:pPr>
+        <w:tabs>
+          <w:tab w:val="num" w:pos="3600"/>
+        </w:tabs>
+        <w:ind w:left="3600" w:hanging="360"/>
+      </w:pPr>
+      <w:rPr>
+        <w:rFonts w:ascii="Wingdings" w:hAnsi="Wingdings" w:hint="default"/>
+        <w:sz w:val="20"/>
+      </w:rPr>
+    </w:lvl>
+    <w:lvl w:ilvl="5" w:tentative="1">
+      <w:start w:val="1"/>
+      <w:numFmt w:val="bullet"/>
+      <w:lvlText w:val=""/>
+      <w:lvlJc w:val="left"/>
+      <w:pPr>
+        <w:tabs>
+          <w:tab w:val="num" w:pos="4320"/>
+        </w:tabs>
+        <w:ind w:left="4320" w:hanging="360"/>
+      </w:pPr>
+      <w:rPr>
+        <w:rFonts w:ascii="Wingdings" w:hAnsi="Wingdings" w:hint="default"/>
+        <w:sz w:val="20"/>
+      </w:rPr>
+    </w:lvl>
+    <w:lvl w:ilvl="6" w:tentative="1">
+      <w:start w:val="1"/>
+      <w:numFmt w:val="bullet"/>
+      <w:lvlText w:val=""/>
+      <w:lvlJc w:val="left"/>
+      <w:pPr>
+        <w:tabs>
+          <w:tab w:val="num" w:pos="5040"/>
+        </w:tabs>
+        <w:ind w:left="5040" w:hanging="360"/>
+      </w:pPr>
+      <w:rPr>
+        <w:rFonts w:ascii="Wingdings" w:hAnsi="Wingdings" w:hint="default"/>
+        <w:sz w:val="20"/>
+      </w:rPr>
+    </w:lvl>
+    <w:lvl w:ilvl="7" w:tentative="1">
+      <w:start w:val="1"/>
+      <w:numFmt w:val="bullet"/>
+      <w:lvlText w:val=""/>
+      <w:lvlJc w:val="left"/>
+      <w:pPr>
+        <w:tabs>
+          <w:tab w:val="num" w:pos="5760"/>
+        </w:tabs>
+        <w:ind w:left="5760" w:hanging="360"/>
+      </w:pPr>
+      <w:rPr>
+        <w:rFonts w:ascii="Wingdings" w:hAnsi="Wingdings" w:hint="default"/>
+        <w:sz w:val="20"/>
+      </w:rPr>
+    </w:lvl>
+    <w:lvl w:ilvl="8" w:tentative="1">
+      <w:start w:val="1"/>
+      <w:numFmt w:val="bullet"/>
+      <w:lvlText w:val=""/>
+      <w:lvlJc w:val="left"/>
+      <w:pPr>
+        <w:tabs>
+          <w:tab w:val="num" w:pos="6480"/>
+        </w:tabs>
+        <w:ind w:left="6480" w:hanging="360"/>
+      </w:pPr>
+      <w:rPr>
+        <w:rFonts w:ascii="Wingdings" w:hAnsi="Wingdings" w:hint="default"/>
+        <w:sz w:val="20"/>
+      </w:rPr>
+    </w:lvl>
+  </w:abstractNum>
   <w:abstractNum w:abstractNumId="2" w15:restartNumberingAfterBreak="0">
-    <w:nsid w:val="04FC70D1"/>
+    <w:nsid w:val="09040A99"/>
     <w:multiLevelType w:val="multilevel"/>
-    <w:tmpl w:val="826613F0"/>
+    <w:tmpl w:val="8BD83E1C"/>
     <w:lvl w:ilvl="0">
       <w:start w:val="1"/>
       <w:numFmt w:val="bullet"/>
@@ -5259,7 +6427,7 @@
         <w:sz w:val="20"/>
       </w:rPr>
     </w:lvl>
-    <w:lvl w:ilvl="1">
+    <w:lvl w:ilvl="1" w:tentative="1">
       <w:start w:val="1"/>
       <w:numFmt w:val="bullet"/>
       <w:lvlText w:val="o"/>
@@ -5389,6 +6557,119 @@
     </w:lvl>
   </w:abstractNum>
   <w:abstractNum w:abstractNumId="3" w15:restartNumberingAfterBreak="0">
+    <w:nsid w:val="0F723ABC"/>
+    <w:multiLevelType w:val="multilevel"/>
+    <w:tmpl w:val="1AD6C4A8"/>
+    <w:lvl w:ilvl="0">
+      <w:start w:val="1"/>
+      <w:numFmt w:val="decimal"/>
+      <w:lvlText w:val="%1."/>
+      <w:lvlJc w:val="left"/>
+      <w:pPr>
+        <w:tabs>
+          <w:tab w:val="num" w:pos="720"/>
+        </w:tabs>
+        <w:ind w:left="720" w:hanging="360"/>
+      </w:pPr>
+    </w:lvl>
+    <w:lvl w:ilvl="1" w:tentative="1">
+      <w:start w:val="1"/>
+      <w:numFmt w:val="decimal"/>
+      <w:lvlText w:val="%2."/>
+      <w:lvlJc w:val="left"/>
+      <w:pPr>
+        <w:tabs>
+          <w:tab w:val="num" w:pos="1440"/>
+        </w:tabs>
+        <w:ind w:left="1440" w:hanging="360"/>
+      </w:pPr>
+    </w:lvl>
+    <w:lvl w:ilvl="2" w:tentative="1">
+      <w:start w:val="1"/>
+      <w:numFmt w:val="decimal"/>
+      <w:lvlText w:val="%3."/>
+      <w:lvlJc w:val="left"/>
+      <w:pPr>
+        <w:tabs>
+          <w:tab w:val="num" w:pos="2160"/>
+        </w:tabs>
+        <w:ind w:left="2160" w:hanging="360"/>
+      </w:pPr>
+    </w:lvl>
+    <w:lvl w:ilvl="3" w:tentative="1">
+      <w:start w:val="1"/>
+      <w:numFmt w:val="decimal"/>
+      <w:lvlText w:val="%4."/>
+      <w:lvlJc w:val="left"/>
+      <w:pPr>
+        <w:tabs>
+          <w:tab w:val="num" w:pos="2880"/>
+        </w:tabs>
+        <w:ind w:left="2880" w:hanging="360"/>
+      </w:pPr>
+    </w:lvl>
+    <w:lvl w:ilvl="4" w:tentative="1">
+      <w:start w:val="1"/>
+      <w:numFmt w:val="decimal"/>
+      <w:lvlText w:val="%5."/>
+      <w:lvlJc w:val="left"/>
+      <w:pPr>
+        <w:tabs>
+          <w:tab w:val="num" w:pos="3600"/>
+        </w:tabs>
+        <w:ind w:left="3600" w:hanging="360"/>
+      </w:pPr>
+    </w:lvl>
+    <w:lvl w:ilvl="5" w:tentative="1">
+      <w:start w:val="1"/>
+      <w:numFmt w:val="decimal"/>
+      <w:lvlText w:val="%6."/>
+      <w:lvlJc w:val="left"/>
+      <w:pPr>
+        <w:tabs>
+          <w:tab w:val="num" w:pos="4320"/>
+        </w:tabs>
+        <w:ind w:left="4320" w:hanging="360"/>
+      </w:pPr>
+    </w:lvl>
+    <w:lvl w:ilvl="6" w:tentative="1">
+      <w:start w:val="1"/>
+      <w:numFmt w:val="decimal"/>
+      <w:lvlText w:val="%7."/>
+      <w:lvlJc w:val="left"/>
+      <w:pPr>
+        <w:tabs>
+          <w:tab w:val="num" w:pos="5040"/>
+        </w:tabs>
+        <w:ind w:left="5040" w:hanging="360"/>
+      </w:pPr>
+    </w:lvl>
+    <w:lvl w:ilvl="7" w:tentative="1">
+      <w:start w:val="1"/>
+      <w:numFmt w:val="decimal"/>
+      <w:lvlText w:val="%8."/>
+      <w:lvlJc w:val="left"/>
+      <w:pPr>
+        <w:tabs>
+          <w:tab w:val="num" w:pos="5760"/>
+        </w:tabs>
+        <w:ind w:left="5760" w:hanging="360"/>
+      </w:pPr>
+    </w:lvl>
+    <w:lvl w:ilvl="8" w:tentative="1">
+      <w:start w:val="1"/>
+      <w:numFmt w:val="decimal"/>
+      <w:lvlText w:val="%9."/>
+      <w:lvlJc w:val="left"/>
+      <w:pPr>
+        <w:tabs>
+          <w:tab w:val="num" w:pos="6480"/>
+        </w:tabs>
+        <w:ind w:left="6480" w:hanging="360"/>
+      </w:pPr>
+    </w:lvl>
+  </w:abstractNum>
+  <w:abstractNum w:abstractNumId="4" w15:restartNumberingAfterBreak="0">
     <w:nsid w:val="11470A31"/>
     <w:multiLevelType w:val="multilevel"/>
     <w:tmpl w:val="6BBC70F2"/>
@@ -5537,7 +6818,305 @@
       </w:rPr>
     </w:lvl>
   </w:abstractNum>
-  <w:abstractNum w:abstractNumId="4" w15:restartNumberingAfterBreak="0">
+  <w:abstractNum w:abstractNumId="5" w15:restartNumberingAfterBreak="0">
+    <w:nsid w:val="15656CD3"/>
+    <w:multiLevelType w:val="multilevel"/>
+    <w:tmpl w:val="587CEEF2"/>
+    <w:lvl w:ilvl="0">
+      <w:start w:val="1"/>
+      <w:numFmt w:val="bullet"/>
+      <w:lvlText w:val=""/>
+      <w:lvlJc w:val="left"/>
+      <w:pPr>
+        <w:tabs>
+          <w:tab w:val="num" w:pos="720"/>
+        </w:tabs>
+        <w:ind w:left="720" w:hanging="360"/>
+      </w:pPr>
+      <w:rPr>
+        <w:rFonts w:ascii="Symbol" w:hAnsi="Symbol" w:hint="default"/>
+        <w:sz w:val="20"/>
+      </w:rPr>
+    </w:lvl>
+    <w:lvl w:ilvl="1" w:tentative="1">
+      <w:start w:val="1"/>
+      <w:numFmt w:val="bullet"/>
+      <w:lvlText w:val="o"/>
+      <w:lvlJc w:val="left"/>
+      <w:pPr>
+        <w:tabs>
+          <w:tab w:val="num" w:pos="1440"/>
+        </w:tabs>
+        <w:ind w:left="1440" w:hanging="360"/>
+      </w:pPr>
+      <w:rPr>
+        <w:rFonts w:ascii="Courier New" w:hAnsi="Courier New" w:hint="default"/>
+        <w:sz w:val="20"/>
+      </w:rPr>
+    </w:lvl>
+    <w:lvl w:ilvl="2" w:tentative="1">
+      <w:start w:val="1"/>
+      <w:numFmt w:val="bullet"/>
+      <w:lvlText w:val=""/>
+      <w:lvlJc w:val="left"/>
+      <w:pPr>
+        <w:tabs>
+          <w:tab w:val="num" w:pos="2160"/>
+        </w:tabs>
+        <w:ind w:left="2160" w:hanging="360"/>
+      </w:pPr>
+      <w:rPr>
+        <w:rFonts w:ascii="Wingdings" w:hAnsi="Wingdings" w:hint="default"/>
+        <w:sz w:val="20"/>
+      </w:rPr>
+    </w:lvl>
+    <w:lvl w:ilvl="3" w:tentative="1">
+      <w:start w:val="1"/>
+      <w:numFmt w:val="bullet"/>
+      <w:lvlText w:val=""/>
+      <w:lvlJc w:val="left"/>
+      <w:pPr>
+        <w:tabs>
+          <w:tab w:val="num" w:pos="2880"/>
+        </w:tabs>
+        <w:ind w:left="2880" w:hanging="360"/>
+      </w:pPr>
+      <w:rPr>
+        <w:rFonts w:ascii="Wingdings" w:hAnsi="Wingdings" w:hint="default"/>
+        <w:sz w:val="20"/>
+      </w:rPr>
+    </w:lvl>
+    <w:lvl w:ilvl="4" w:tentative="1">
+      <w:start w:val="1"/>
+      <w:numFmt w:val="bullet"/>
+      <w:lvlText w:val=""/>
+      <w:lvlJc w:val="left"/>
+      <w:pPr>
+        <w:tabs>
+          <w:tab w:val="num" w:pos="3600"/>
+        </w:tabs>
+        <w:ind w:left="3600" w:hanging="360"/>
+      </w:pPr>
+      <w:rPr>
+        <w:rFonts w:ascii="Wingdings" w:hAnsi="Wingdings" w:hint="default"/>
+        <w:sz w:val="20"/>
+      </w:rPr>
+    </w:lvl>
+    <w:lvl w:ilvl="5" w:tentative="1">
+      <w:start w:val="1"/>
+      <w:numFmt w:val="bullet"/>
+      <w:lvlText w:val=""/>
+      <w:lvlJc w:val="left"/>
+      <w:pPr>
+        <w:tabs>
+          <w:tab w:val="num" w:pos="4320"/>
+        </w:tabs>
+        <w:ind w:left="4320" w:hanging="360"/>
+      </w:pPr>
+      <w:rPr>
+        <w:rFonts w:ascii="Wingdings" w:hAnsi="Wingdings" w:hint="default"/>
+        <w:sz w:val="20"/>
+      </w:rPr>
+    </w:lvl>
+    <w:lvl w:ilvl="6" w:tentative="1">
+      <w:start w:val="1"/>
+      <w:numFmt w:val="bullet"/>
+      <w:lvlText w:val=""/>
+      <w:lvlJc w:val="left"/>
+      <w:pPr>
+        <w:tabs>
+          <w:tab w:val="num" w:pos="5040"/>
+        </w:tabs>
+        <w:ind w:left="5040" w:hanging="360"/>
+      </w:pPr>
+      <w:rPr>
+        <w:rFonts w:ascii="Wingdings" w:hAnsi="Wingdings" w:hint="default"/>
+        <w:sz w:val="20"/>
+      </w:rPr>
+    </w:lvl>
+    <w:lvl w:ilvl="7" w:tentative="1">
+      <w:start w:val="1"/>
+      <w:numFmt w:val="bullet"/>
+      <w:lvlText w:val=""/>
+      <w:lvlJc w:val="left"/>
+      <w:pPr>
+        <w:tabs>
+          <w:tab w:val="num" w:pos="5760"/>
+        </w:tabs>
+        <w:ind w:left="5760" w:hanging="360"/>
+      </w:pPr>
+      <w:rPr>
+        <w:rFonts w:ascii="Wingdings" w:hAnsi="Wingdings" w:hint="default"/>
+        <w:sz w:val="20"/>
+      </w:rPr>
+    </w:lvl>
+    <w:lvl w:ilvl="8" w:tentative="1">
+      <w:start w:val="1"/>
+      <w:numFmt w:val="bullet"/>
+      <w:lvlText w:val=""/>
+      <w:lvlJc w:val="left"/>
+      <w:pPr>
+        <w:tabs>
+          <w:tab w:val="num" w:pos="6480"/>
+        </w:tabs>
+        <w:ind w:left="6480" w:hanging="360"/>
+      </w:pPr>
+      <w:rPr>
+        <w:rFonts w:ascii="Wingdings" w:hAnsi="Wingdings" w:hint="default"/>
+        <w:sz w:val="20"/>
+      </w:rPr>
+    </w:lvl>
+  </w:abstractNum>
+  <w:abstractNum w:abstractNumId="6" w15:restartNumberingAfterBreak="0">
+    <w:nsid w:val="16C81FD0"/>
+    <w:multiLevelType w:val="multilevel"/>
+    <w:tmpl w:val="429A724E"/>
+    <w:lvl w:ilvl="0">
+      <w:start w:val="1"/>
+      <w:numFmt w:val="bullet"/>
+      <w:lvlText w:val=""/>
+      <w:lvlJc w:val="left"/>
+      <w:pPr>
+        <w:tabs>
+          <w:tab w:val="num" w:pos="720"/>
+        </w:tabs>
+        <w:ind w:left="720" w:hanging="360"/>
+      </w:pPr>
+      <w:rPr>
+        <w:rFonts w:ascii="Symbol" w:hAnsi="Symbol" w:hint="default"/>
+        <w:sz w:val="20"/>
+      </w:rPr>
+    </w:lvl>
+    <w:lvl w:ilvl="1" w:tentative="1">
+      <w:start w:val="1"/>
+      <w:numFmt w:val="bullet"/>
+      <w:lvlText w:val="o"/>
+      <w:lvlJc w:val="left"/>
+      <w:pPr>
+        <w:tabs>
+          <w:tab w:val="num" w:pos="1440"/>
+        </w:tabs>
+        <w:ind w:left="1440" w:hanging="360"/>
+      </w:pPr>
+      <w:rPr>
+        <w:rFonts w:ascii="Courier New" w:hAnsi="Courier New" w:hint="default"/>
+        <w:sz w:val="20"/>
+      </w:rPr>
+    </w:lvl>
+    <w:lvl w:ilvl="2" w:tentative="1">
+      <w:start w:val="1"/>
+      <w:numFmt w:val="bullet"/>
+      <w:lvlText w:val=""/>
+      <w:lvlJc w:val="left"/>
+      <w:pPr>
+        <w:tabs>
+          <w:tab w:val="num" w:pos="2160"/>
+        </w:tabs>
+        <w:ind w:left="2160" w:hanging="360"/>
+      </w:pPr>
+      <w:rPr>
+        <w:rFonts w:ascii="Wingdings" w:hAnsi="Wingdings" w:hint="default"/>
+        <w:sz w:val="20"/>
+      </w:rPr>
+    </w:lvl>
+    <w:lvl w:ilvl="3" w:tentative="1">
+      <w:start w:val="1"/>
+      <w:numFmt w:val="bullet"/>
+      <w:lvlText w:val=""/>
+      <w:lvlJc w:val="left"/>
+      <w:pPr>
+        <w:tabs>
+          <w:tab w:val="num" w:pos="2880"/>
+        </w:tabs>
+        <w:ind w:left="2880" w:hanging="360"/>
+      </w:pPr>
+      <w:rPr>
+        <w:rFonts w:ascii="Wingdings" w:hAnsi="Wingdings" w:hint="default"/>
+        <w:sz w:val="20"/>
+      </w:rPr>
+    </w:lvl>
+    <w:lvl w:ilvl="4" w:tentative="1">
+      <w:start w:val="1"/>
+      <w:numFmt w:val="bullet"/>
+      <w:lvlText w:val=""/>
+      <w:lvlJc w:val="left"/>
+      <w:pPr>
+        <w:tabs>
+          <w:tab w:val="num" w:pos="3600"/>
+        </w:tabs>
+        <w:ind w:left="3600" w:hanging="360"/>
+      </w:pPr>
+      <w:rPr>
+        <w:rFonts w:ascii="Wingdings" w:hAnsi="Wingdings" w:hint="default"/>
+        <w:sz w:val="20"/>
+      </w:rPr>
+    </w:lvl>
+    <w:lvl w:ilvl="5" w:tentative="1">
+      <w:start w:val="1"/>
+      <w:numFmt w:val="bullet"/>
+      <w:lvlText w:val=""/>
+      <w:lvlJc w:val="left"/>
+      <w:pPr>
+        <w:tabs>
+          <w:tab w:val="num" w:pos="4320"/>
+        </w:tabs>
+        <w:ind w:left="4320" w:hanging="360"/>
+      </w:pPr>
+      <w:rPr>
+        <w:rFonts w:ascii="Wingdings" w:hAnsi="Wingdings" w:hint="default"/>
+        <w:sz w:val="20"/>
+      </w:rPr>
+    </w:lvl>
+    <w:lvl w:ilvl="6" w:tentative="1">
+      <w:start w:val="1"/>
+      <w:numFmt w:val="bullet"/>
+      <w:lvlText w:val=""/>
+      <w:lvlJc w:val="left"/>
+      <w:pPr>
+        <w:tabs>
+          <w:tab w:val="num" w:pos="5040"/>
+        </w:tabs>
+        <w:ind w:left="5040" w:hanging="360"/>
+      </w:pPr>
+      <w:rPr>
+        <w:rFonts w:ascii="Wingdings" w:hAnsi="Wingdings" w:hint="default"/>
+        <w:sz w:val="20"/>
+      </w:rPr>
+    </w:lvl>
+    <w:lvl w:ilvl="7" w:tentative="1">
+      <w:start w:val="1"/>
+      <w:numFmt w:val="bullet"/>
+      <w:lvlText w:val=""/>
+      <w:lvlJc w:val="left"/>
+      <w:pPr>
+        <w:tabs>
+          <w:tab w:val="num" w:pos="5760"/>
+        </w:tabs>
+        <w:ind w:left="5760" w:hanging="360"/>
+      </w:pPr>
+      <w:rPr>
+        <w:rFonts w:ascii="Wingdings" w:hAnsi="Wingdings" w:hint="default"/>
+        <w:sz w:val="20"/>
+      </w:rPr>
+    </w:lvl>
+    <w:lvl w:ilvl="8" w:tentative="1">
+      <w:start w:val="1"/>
+      <w:numFmt w:val="bullet"/>
+      <w:lvlText w:val=""/>
+      <w:lvlJc w:val="left"/>
+      <w:pPr>
+        <w:tabs>
+          <w:tab w:val="num" w:pos="6480"/>
+        </w:tabs>
+        <w:ind w:left="6480" w:hanging="360"/>
+      </w:pPr>
+      <w:rPr>
+        <w:rFonts w:ascii="Wingdings" w:hAnsi="Wingdings" w:hint="default"/>
+        <w:sz w:val="20"/>
+      </w:rPr>
+    </w:lvl>
+  </w:abstractNum>
+  <w:abstractNum w:abstractNumId="7" w15:restartNumberingAfterBreak="0">
     <w:nsid w:val="16CF3497"/>
     <w:multiLevelType w:val="multilevel"/>
     <w:tmpl w:val="69101E54"/>
@@ -5686,7 +7265,7 @@
       </w:rPr>
     </w:lvl>
   </w:abstractNum>
-  <w:abstractNum w:abstractNumId="5" w15:restartNumberingAfterBreak="0">
+  <w:abstractNum w:abstractNumId="8" w15:restartNumberingAfterBreak="0">
     <w:nsid w:val="1797215E"/>
     <w:multiLevelType w:val="multilevel"/>
     <w:tmpl w:val="8D30F112"/>
@@ -5835,10 +7414,10 @@
       </w:rPr>
     </w:lvl>
   </w:abstractNum>
-  <w:abstractNum w:abstractNumId="6" w15:restartNumberingAfterBreak="0">
-    <w:nsid w:val="1CF1045F"/>
+  <w:abstractNum w:abstractNumId="9" w15:restartNumberingAfterBreak="0">
+    <w:nsid w:val="1B6E1367"/>
     <w:multiLevelType w:val="multilevel"/>
-    <w:tmpl w:val="B9F21D12"/>
+    <w:tmpl w:val="FA8A4752"/>
     <w:lvl w:ilvl="0">
       <w:start w:val="1"/>
       <w:numFmt w:val="bullet"/>
@@ -5855,7 +7434,7 @@
         <w:sz w:val="20"/>
       </w:rPr>
     </w:lvl>
-    <w:lvl w:ilvl="1">
+    <w:lvl w:ilvl="1" w:tentative="1">
       <w:start w:val="1"/>
       <w:numFmt w:val="bullet"/>
       <w:lvlText w:val="o"/>
@@ -5984,10 +7563,10 @@
       </w:rPr>
     </w:lvl>
   </w:abstractNum>
-  <w:abstractNum w:abstractNumId="7" w15:restartNumberingAfterBreak="0">
-    <w:nsid w:val="1EEC7646"/>
+  <w:abstractNum w:abstractNumId="10" w15:restartNumberingAfterBreak="0">
+    <w:nsid w:val="1C4E01FA"/>
     <w:multiLevelType w:val="multilevel"/>
-    <w:tmpl w:val="689E055A"/>
+    <w:tmpl w:val="E1146E38"/>
     <w:lvl w:ilvl="0">
       <w:start w:val="1"/>
       <w:numFmt w:val="bullet"/>
@@ -6004,7 +7583,7 @@
         <w:sz w:val="20"/>
       </w:rPr>
     </w:lvl>
-    <w:lvl w:ilvl="1">
+    <w:lvl w:ilvl="1" w:tentative="1">
       <w:start w:val="1"/>
       <w:numFmt w:val="bullet"/>
       <w:lvlText w:val="o"/>
@@ -6133,7 +7712,305 @@
       </w:rPr>
     </w:lvl>
   </w:abstractNum>
-  <w:abstractNum w:abstractNumId="8" w15:restartNumberingAfterBreak="0">
+  <w:abstractNum w:abstractNumId="11" w15:restartNumberingAfterBreak="0">
+    <w:nsid w:val="1F901E9B"/>
+    <w:multiLevelType w:val="multilevel"/>
+    <w:tmpl w:val="C8B42F60"/>
+    <w:lvl w:ilvl="0">
+      <w:start w:val="1"/>
+      <w:numFmt w:val="bullet"/>
+      <w:lvlText w:val=""/>
+      <w:lvlJc w:val="left"/>
+      <w:pPr>
+        <w:tabs>
+          <w:tab w:val="num" w:pos="720"/>
+        </w:tabs>
+        <w:ind w:left="720" w:hanging="360"/>
+      </w:pPr>
+      <w:rPr>
+        <w:rFonts w:ascii="Symbol" w:hAnsi="Symbol" w:hint="default"/>
+        <w:sz w:val="20"/>
+      </w:rPr>
+    </w:lvl>
+    <w:lvl w:ilvl="1" w:tentative="1">
+      <w:start w:val="1"/>
+      <w:numFmt w:val="bullet"/>
+      <w:lvlText w:val="o"/>
+      <w:lvlJc w:val="left"/>
+      <w:pPr>
+        <w:tabs>
+          <w:tab w:val="num" w:pos="1440"/>
+        </w:tabs>
+        <w:ind w:left="1440" w:hanging="360"/>
+      </w:pPr>
+      <w:rPr>
+        <w:rFonts w:ascii="Courier New" w:hAnsi="Courier New" w:hint="default"/>
+        <w:sz w:val="20"/>
+      </w:rPr>
+    </w:lvl>
+    <w:lvl w:ilvl="2" w:tentative="1">
+      <w:start w:val="1"/>
+      <w:numFmt w:val="bullet"/>
+      <w:lvlText w:val=""/>
+      <w:lvlJc w:val="left"/>
+      <w:pPr>
+        <w:tabs>
+          <w:tab w:val="num" w:pos="2160"/>
+        </w:tabs>
+        <w:ind w:left="2160" w:hanging="360"/>
+      </w:pPr>
+      <w:rPr>
+        <w:rFonts w:ascii="Wingdings" w:hAnsi="Wingdings" w:hint="default"/>
+        <w:sz w:val="20"/>
+      </w:rPr>
+    </w:lvl>
+    <w:lvl w:ilvl="3" w:tentative="1">
+      <w:start w:val="1"/>
+      <w:numFmt w:val="bullet"/>
+      <w:lvlText w:val=""/>
+      <w:lvlJc w:val="left"/>
+      <w:pPr>
+        <w:tabs>
+          <w:tab w:val="num" w:pos="2880"/>
+        </w:tabs>
+        <w:ind w:left="2880" w:hanging="360"/>
+      </w:pPr>
+      <w:rPr>
+        <w:rFonts w:ascii="Wingdings" w:hAnsi="Wingdings" w:hint="default"/>
+        <w:sz w:val="20"/>
+      </w:rPr>
+    </w:lvl>
+    <w:lvl w:ilvl="4" w:tentative="1">
+      <w:start w:val="1"/>
+      <w:numFmt w:val="bullet"/>
+      <w:lvlText w:val=""/>
+      <w:lvlJc w:val="left"/>
+      <w:pPr>
+        <w:tabs>
+          <w:tab w:val="num" w:pos="3600"/>
+        </w:tabs>
+        <w:ind w:left="3600" w:hanging="360"/>
+      </w:pPr>
+      <w:rPr>
+        <w:rFonts w:ascii="Wingdings" w:hAnsi="Wingdings" w:hint="default"/>
+        <w:sz w:val="20"/>
+      </w:rPr>
+    </w:lvl>
+    <w:lvl w:ilvl="5" w:tentative="1">
+      <w:start w:val="1"/>
+      <w:numFmt w:val="bullet"/>
+      <w:lvlText w:val=""/>
+      <w:lvlJc w:val="left"/>
+      <w:pPr>
+        <w:tabs>
+          <w:tab w:val="num" w:pos="4320"/>
+        </w:tabs>
+        <w:ind w:left="4320" w:hanging="360"/>
+      </w:pPr>
+      <w:rPr>
+        <w:rFonts w:ascii="Wingdings" w:hAnsi="Wingdings" w:hint="default"/>
+        <w:sz w:val="20"/>
+      </w:rPr>
+    </w:lvl>
+    <w:lvl w:ilvl="6" w:tentative="1">
+      <w:start w:val="1"/>
+      <w:numFmt w:val="bullet"/>
+      <w:lvlText w:val=""/>
+      <w:lvlJc w:val="left"/>
+      <w:pPr>
+        <w:tabs>
+          <w:tab w:val="num" w:pos="5040"/>
+        </w:tabs>
+        <w:ind w:left="5040" w:hanging="360"/>
+      </w:pPr>
+      <w:rPr>
+        <w:rFonts w:ascii="Wingdings" w:hAnsi="Wingdings" w:hint="default"/>
+        <w:sz w:val="20"/>
+      </w:rPr>
+    </w:lvl>
+    <w:lvl w:ilvl="7" w:tentative="1">
+      <w:start w:val="1"/>
+      <w:numFmt w:val="bullet"/>
+      <w:lvlText w:val=""/>
+      <w:lvlJc w:val="left"/>
+      <w:pPr>
+        <w:tabs>
+          <w:tab w:val="num" w:pos="5760"/>
+        </w:tabs>
+        <w:ind w:left="5760" w:hanging="360"/>
+      </w:pPr>
+      <w:rPr>
+        <w:rFonts w:ascii="Wingdings" w:hAnsi="Wingdings" w:hint="default"/>
+        <w:sz w:val="20"/>
+      </w:rPr>
+    </w:lvl>
+    <w:lvl w:ilvl="8" w:tentative="1">
+      <w:start w:val="1"/>
+      <w:numFmt w:val="bullet"/>
+      <w:lvlText w:val=""/>
+      <w:lvlJc w:val="left"/>
+      <w:pPr>
+        <w:tabs>
+          <w:tab w:val="num" w:pos="6480"/>
+        </w:tabs>
+        <w:ind w:left="6480" w:hanging="360"/>
+      </w:pPr>
+      <w:rPr>
+        <w:rFonts w:ascii="Wingdings" w:hAnsi="Wingdings" w:hint="default"/>
+        <w:sz w:val="20"/>
+      </w:rPr>
+    </w:lvl>
+  </w:abstractNum>
+  <w:abstractNum w:abstractNumId="12" w15:restartNumberingAfterBreak="0">
+    <w:nsid w:val="216E28BF"/>
+    <w:multiLevelType w:val="multilevel"/>
+    <w:tmpl w:val="9E163B86"/>
+    <w:lvl w:ilvl="0">
+      <w:start w:val="1"/>
+      <w:numFmt w:val="bullet"/>
+      <w:lvlText w:val=""/>
+      <w:lvlJc w:val="left"/>
+      <w:pPr>
+        <w:tabs>
+          <w:tab w:val="num" w:pos="720"/>
+        </w:tabs>
+        <w:ind w:left="720" w:hanging="360"/>
+      </w:pPr>
+      <w:rPr>
+        <w:rFonts w:ascii="Symbol" w:hAnsi="Symbol" w:hint="default"/>
+        <w:sz w:val="20"/>
+      </w:rPr>
+    </w:lvl>
+    <w:lvl w:ilvl="1" w:tentative="1">
+      <w:start w:val="1"/>
+      <w:numFmt w:val="bullet"/>
+      <w:lvlText w:val="o"/>
+      <w:lvlJc w:val="left"/>
+      <w:pPr>
+        <w:tabs>
+          <w:tab w:val="num" w:pos="1440"/>
+        </w:tabs>
+        <w:ind w:left="1440" w:hanging="360"/>
+      </w:pPr>
+      <w:rPr>
+        <w:rFonts w:ascii="Courier New" w:hAnsi="Courier New" w:hint="default"/>
+        <w:sz w:val="20"/>
+      </w:rPr>
+    </w:lvl>
+    <w:lvl w:ilvl="2" w:tentative="1">
+      <w:start w:val="1"/>
+      <w:numFmt w:val="bullet"/>
+      <w:lvlText w:val=""/>
+      <w:lvlJc w:val="left"/>
+      <w:pPr>
+        <w:tabs>
+          <w:tab w:val="num" w:pos="2160"/>
+        </w:tabs>
+        <w:ind w:left="2160" w:hanging="360"/>
+      </w:pPr>
+      <w:rPr>
+        <w:rFonts w:ascii="Wingdings" w:hAnsi="Wingdings" w:hint="default"/>
+        <w:sz w:val="20"/>
+      </w:rPr>
+    </w:lvl>
+    <w:lvl w:ilvl="3" w:tentative="1">
+      <w:start w:val="1"/>
+      <w:numFmt w:val="bullet"/>
+      <w:lvlText w:val=""/>
+      <w:lvlJc w:val="left"/>
+      <w:pPr>
+        <w:tabs>
+          <w:tab w:val="num" w:pos="2880"/>
+        </w:tabs>
+        <w:ind w:left="2880" w:hanging="360"/>
+      </w:pPr>
+      <w:rPr>
+        <w:rFonts w:ascii="Wingdings" w:hAnsi="Wingdings" w:hint="default"/>
+        <w:sz w:val="20"/>
+      </w:rPr>
+    </w:lvl>
+    <w:lvl w:ilvl="4" w:tentative="1">
+      <w:start w:val="1"/>
+      <w:numFmt w:val="bullet"/>
+      <w:lvlText w:val=""/>
+      <w:lvlJc w:val="left"/>
+      <w:pPr>
+        <w:tabs>
+          <w:tab w:val="num" w:pos="3600"/>
+        </w:tabs>
+        <w:ind w:left="3600" w:hanging="360"/>
+      </w:pPr>
+      <w:rPr>
+        <w:rFonts w:ascii="Wingdings" w:hAnsi="Wingdings" w:hint="default"/>
+        <w:sz w:val="20"/>
+      </w:rPr>
+    </w:lvl>
+    <w:lvl w:ilvl="5" w:tentative="1">
+      <w:start w:val="1"/>
+      <w:numFmt w:val="bullet"/>
+      <w:lvlText w:val=""/>
+      <w:lvlJc w:val="left"/>
+      <w:pPr>
+        <w:tabs>
+          <w:tab w:val="num" w:pos="4320"/>
+        </w:tabs>
+        <w:ind w:left="4320" w:hanging="360"/>
+      </w:pPr>
+      <w:rPr>
+        <w:rFonts w:ascii="Wingdings" w:hAnsi="Wingdings" w:hint="default"/>
+        <w:sz w:val="20"/>
+      </w:rPr>
+    </w:lvl>
+    <w:lvl w:ilvl="6" w:tentative="1">
+      <w:start w:val="1"/>
+      <w:numFmt w:val="bullet"/>
+      <w:lvlText w:val=""/>
+      <w:lvlJc w:val="left"/>
+      <w:pPr>
+        <w:tabs>
+          <w:tab w:val="num" w:pos="5040"/>
+        </w:tabs>
+        <w:ind w:left="5040" w:hanging="360"/>
+      </w:pPr>
+      <w:rPr>
+        <w:rFonts w:ascii="Wingdings" w:hAnsi="Wingdings" w:hint="default"/>
+        <w:sz w:val="20"/>
+      </w:rPr>
+    </w:lvl>
+    <w:lvl w:ilvl="7" w:tentative="1">
+      <w:start w:val="1"/>
+      <w:numFmt w:val="bullet"/>
+      <w:lvlText w:val=""/>
+      <w:lvlJc w:val="left"/>
+      <w:pPr>
+        <w:tabs>
+          <w:tab w:val="num" w:pos="5760"/>
+        </w:tabs>
+        <w:ind w:left="5760" w:hanging="360"/>
+      </w:pPr>
+      <w:rPr>
+        <w:rFonts w:ascii="Wingdings" w:hAnsi="Wingdings" w:hint="default"/>
+        <w:sz w:val="20"/>
+      </w:rPr>
+    </w:lvl>
+    <w:lvl w:ilvl="8" w:tentative="1">
+      <w:start w:val="1"/>
+      <w:numFmt w:val="bullet"/>
+      <w:lvlText w:val=""/>
+      <w:lvlJc w:val="left"/>
+      <w:pPr>
+        <w:tabs>
+          <w:tab w:val="num" w:pos="6480"/>
+        </w:tabs>
+        <w:ind w:left="6480" w:hanging="360"/>
+      </w:pPr>
+      <w:rPr>
+        <w:rFonts w:ascii="Wingdings" w:hAnsi="Wingdings" w:hint="default"/>
+        <w:sz w:val="20"/>
+      </w:rPr>
+    </w:lvl>
+  </w:abstractNum>
+  <w:abstractNum w:abstractNumId="13" w15:restartNumberingAfterBreak="0">
     <w:nsid w:val="2832509A"/>
     <w:multiLevelType w:val="multilevel"/>
     <w:tmpl w:val="B9DA607C"/>
@@ -6282,14 +8159,14 @@
       </w:rPr>
     </w:lvl>
   </w:abstractNum>
-  <w:abstractNum w:abstractNumId="9" w15:restartNumberingAfterBreak="0">
-    <w:nsid w:val="31E84751"/>
+  <w:abstractNum w:abstractNumId="14" w15:restartNumberingAfterBreak="0">
+    <w:nsid w:val="2E757799"/>
     <w:multiLevelType w:val="multilevel"/>
-    <w:tmpl w:val="6C28AE6C"/>
+    <w:tmpl w:val="EE469620"/>
     <w:lvl w:ilvl="0">
       <w:start w:val="1"/>
-      <w:numFmt w:val="bullet"/>
-      <w:lvlText w:val=""/>
+      <w:numFmt w:val="decimal"/>
+      <w:lvlText w:val="%1."/>
       <w:lvlJc w:val="left"/>
       <w:pPr>
         <w:tabs>
@@ -6297,15 +8174,11 @@
         </w:tabs>
         <w:ind w:left="720" w:hanging="360"/>
       </w:pPr>
-      <w:rPr>
-        <w:rFonts w:ascii="Symbol" w:hAnsi="Symbol" w:hint="default"/>
-        <w:sz w:val="20"/>
-      </w:rPr>
-    </w:lvl>
-    <w:lvl w:ilvl="1">
-      <w:start w:val="1"/>
-      <w:numFmt w:val="bullet"/>
-      <w:lvlText w:val="o"/>
+    </w:lvl>
+    <w:lvl w:ilvl="1" w:tentative="1">
+      <w:start w:val="1"/>
+      <w:numFmt w:val="decimal"/>
+      <w:lvlText w:val="%2."/>
       <w:lvlJc w:val="left"/>
       <w:pPr>
         <w:tabs>
@@ -6313,15 +8186,11 @@
         </w:tabs>
         <w:ind w:left="1440" w:hanging="360"/>
       </w:pPr>
-      <w:rPr>
-        <w:rFonts w:ascii="Courier New" w:hAnsi="Courier New" w:hint="default"/>
-        <w:sz w:val="20"/>
-      </w:rPr>
     </w:lvl>
     <w:lvl w:ilvl="2" w:tentative="1">
       <w:start w:val="1"/>
-      <w:numFmt w:val="bullet"/>
-      <w:lvlText w:val=""/>
+      <w:numFmt w:val="decimal"/>
+      <w:lvlText w:val="%3."/>
       <w:lvlJc w:val="left"/>
       <w:pPr>
         <w:tabs>
@@ -6329,15 +8198,11 @@
         </w:tabs>
         <w:ind w:left="2160" w:hanging="360"/>
       </w:pPr>
-      <w:rPr>
-        <w:rFonts w:ascii="Wingdings" w:hAnsi="Wingdings" w:hint="default"/>
-        <w:sz w:val="20"/>
-      </w:rPr>
     </w:lvl>
     <w:lvl w:ilvl="3" w:tentative="1">
       <w:start w:val="1"/>
-      <w:numFmt w:val="bullet"/>
-      <w:lvlText w:val=""/>
+      <w:numFmt w:val="decimal"/>
+      <w:lvlText w:val="%4."/>
       <w:lvlJc w:val="left"/>
       <w:pPr>
         <w:tabs>
@@ -6345,15 +8210,11 @@
         </w:tabs>
         <w:ind w:left="2880" w:hanging="360"/>
       </w:pPr>
-      <w:rPr>
-        <w:rFonts w:ascii="Wingdings" w:hAnsi="Wingdings" w:hint="default"/>
-        <w:sz w:val="20"/>
-      </w:rPr>
     </w:lvl>
     <w:lvl w:ilvl="4" w:tentative="1">
       <w:start w:val="1"/>
-      <w:numFmt w:val="bullet"/>
-      <w:lvlText w:val=""/>
+      <w:numFmt w:val="decimal"/>
+      <w:lvlText w:val="%5."/>
       <w:lvlJc w:val="left"/>
       <w:pPr>
         <w:tabs>
@@ -6361,15 +8222,11 @@
         </w:tabs>
         <w:ind w:left="3600" w:hanging="360"/>
       </w:pPr>
-      <w:rPr>
-        <w:rFonts w:ascii="Wingdings" w:hAnsi="Wingdings" w:hint="default"/>
-        <w:sz w:val="20"/>
-      </w:rPr>
     </w:lvl>
     <w:lvl w:ilvl="5" w:tentative="1">
       <w:start w:val="1"/>
-      <w:numFmt w:val="bullet"/>
-      <w:lvlText w:val=""/>
+      <w:numFmt w:val="decimal"/>
+      <w:lvlText w:val="%6."/>
       <w:lvlJc w:val="left"/>
       <w:pPr>
         <w:tabs>
@@ -6377,15 +8234,11 @@
         </w:tabs>
         <w:ind w:left="4320" w:hanging="360"/>
       </w:pPr>
-      <w:rPr>
-        <w:rFonts w:ascii="Wingdings" w:hAnsi="Wingdings" w:hint="default"/>
-        <w:sz w:val="20"/>
-      </w:rPr>
     </w:lvl>
     <w:lvl w:ilvl="6" w:tentative="1">
       <w:start w:val="1"/>
-      <w:numFmt w:val="bullet"/>
-      <w:lvlText w:val=""/>
+      <w:numFmt w:val="decimal"/>
+      <w:lvlText w:val="%7."/>
       <w:lvlJc w:val="left"/>
       <w:pPr>
         <w:tabs>
@@ -6393,15 +8246,11 @@
         </w:tabs>
         <w:ind w:left="5040" w:hanging="360"/>
       </w:pPr>
-      <w:rPr>
-        <w:rFonts w:ascii="Wingdings" w:hAnsi="Wingdings" w:hint="default"/>
-        <w:sz w:val="20"/>
-      </w:rPr>
     </w:lvl>
     <w:lvl w:ilvl="7" w:tentative="1">
       <w:start w:val="1"/>
-      <w:numFmt w:val="bullet"/>
-      <w:lvlText w:val=""/>
+      <w:numFmt w:val="decimal"/>
+      <w:lvlText w:val="%8."/>
       <w:lvlJc w:val="left"/>
       <w:pPr>
         <w:tabs>
@@ -6409,15 +8258,11 @@
         </w:tabs>
         <w:ind w:left="5760" w:hanging="360"/>
       </w:pPr>
-      <w:rPr>
-        <w:rFonts w:ascii="Wingdings" w:hAnsi="Wingdings" w:hint="default"/>
-        <w:sz w:val="20"/>
-      </w:rPr>
     </w:lvl>
     <w:lvl w:ilvl="8" w:tentative="1">
       <w:start w:val="1"/>
-      <w:numFmt w:val="bullet"/>
-      <w:lvlText w:val=""/>
+      <w:numFmt w:val="decimal"/>
+      <w:lvlText w:val="%9."/>
       <w:lvlJc w:val="left"/>
       <w:pPr>
         <w:tabs>
@@ -6425,13 +8270,9 @@
         </w:tabs>
         <w:ind w:left="6480" w:hanging="360"/>
       </w:pPr>
-      <w:rPr>
-        <w:rFonts w:ascii="Wingdings" w:hAnsi="Wingdings" w:hint="default"/>
-        <w:sz w:val="20"/>
-      </w:rPr>
     </w:lvl>
   </w:abstractNum>
-  <w:abstractNum w:abstractNumId="10" w15:restartNumberingAfterBreak="0">
+  <w:abstractNum w:abstractNumId="15" w15:restartNumberingAfterBreak="0">
     <w:nsid w:val="33E212B3"/>
     <w:multiLevelType w:val="multilevel"/>
     <w:tmpl w:val="3B02072C"/>
@@ -6580,7 +8421,7 @@
       </w:rPr>
     </w:lvl>
   </w:abstractNum>
-  <w:abstractNum w:abstractNumId="11" w15:restartNumberingAfterBreak="0">
+  <w:abstractNum w:abstractNumId="16" w15:restartNumberingAfterBreak="0">
     <w:nsid w:val="33EA657D"/>
     <w:multiLevelType w:val="multilevel"/>
     <w:tmpl w:val="79DC64D2"/>
@@ -6729,10 +8570,10 @@
       </w:rPr>
     </w:lvl>
   </w:abstractNum>
-  <w:abstractNum w:abstractNumId="12" w15:restartNumberingAfterBreak="0">
-    <w:nsid w:val="34567C17"/>
+  <w:abstractNum w:abstractNumId="17" w15:restartNumberingAfterBreak="0">
+    <w:nsid w:val="369D6B25"/>
     <w:multiLevelType w:val="multilevel"/>
-    <w:tmpl w:val="996EAD30"/>
+    <w:tmpl w:val="7AF2317E"/>
     <w:lvl w:ilvl="0">
       <w:start w:val="1"/>
       <w:numFmt w:val="bullet"/>
@@ -6749,7 +8590,7 @@
         <w:sz w:val="20"/>
       </w:rPr>
     </w:lvl>
-    <w:lvl w:ilvl="1">
+    <w:lvl w:ilvl="1" w:tentative="1">
       <w:start w:val="1"/>
       <w:numFmt w:val="bullet"/>
       <w:lvlText w:val="o"/>
@@ -6878,156 +8719,7 @@
       </w:rPr>
     </w:lvl>
   </w:abstractNum>
-  <w:abstractNum w:abstractNumId="13" w15:restartNumberingAfterBreak="0">
-    <w:nsid w:val="35F52B37"/>
-    <w:multiLevelType w:val="multilevel"/>
-    <w:tmpl w:val="276CE3AE"/>
-    <w:lvl w:ilvl="0">
-      <w:start w:val="1"/>
-      <w:numFmt w:val="bullet"/>
-      <w:lvlText w:val=""/>
-      <w:lvlJc w:val="left"/>
-      <w:pPr>
-        <w:tabs>
-          <w:tab w:val="num" w:pos="720"/>
-        </w:tabs>
-        <w:ind w:left="720" w:hanging="360"/>
-      </w:pPr>
-      <w:rPr>
-        <w:rFonts w:ascii="Symbol" w:hAnsi="Symbol" w:hint="default"/>
-        <w:sz w:val="20"/>
-      </w:rPr>
-    </w:lvl>
-    <w:lvl w:ilvl="1">
-      <w:start w:val="1"/>
-      <w:numFmt w:val="bullet"/>
-      <w:lvlText w:val="o"/>
-      <w:lvlJc w:val="left"/>
-      <w:pPr>
-        <w:tabs>
-          <w:tab w:val="num" w:pos="1440"/>
-        </w:tabs>
-        <w:ind w:left="1440" w:hanging="360"/>
-      </w:pPr>
-      <w:rPr>
-        <w:rFonts w:ascii="Courier New" w:hAnsi="Courier New" w:hint="default"/>
-        <w:sz w:val="20"/>
-      </w:rPr>
-    </w:lvl>
-    <w:lvl w:ilvl="2" w:tentative="1">
-      <w:start w:val="1"/>
-      <w:numFmt w:val="bullet"/>
-      <w:lvlText w:val=""/>
-      <w:lvlJc w:val="left"/>
-      <w:pPr>
-        <w:tabs>
-          <w:tab w:val="num" w:pos="2160"/>
-        </w:tabs>
-        <w:ind w:left="2160" w:hanging="360"/>
-      </w:pPr>
-      <w:rPr>
-        <w:rFonts w:ascii="Wingdings" w:hAnsi="Wingdings" w:hint="default"/>
-        <w:sz w:val="20"/>
-      </w:rPr>
-    </w:lvl>
-    <w:lvl w:ilvl="3" w:tentative="1">
-      <w:start w:val="1"/>
-      <w:numFmt w:val="bullet"/>
-      <w:lvlText w:val=""/>
-      <w:lvlJc w:val="left"/>
-      <w:pPr>
-        <w:tabs>
-          <w:tab w:val="num" w:pos="2880"/>
-        </w:tabs>
-        <w:ind w:left="2880" w:hanging="360"/>
-      </w:pPr>
-      <w:rPr>
-        <w:rFonts w:ascii="Wingdings" w:hAnsi="Wingdings" w:hint="default"/>
-        <w:sz w:val="20"/>
-      </w:rPr>
-    </w:lvl>
-    <w:lvl w:ilvl="4" w:tentative="1">
-      <w:start w:val="1"/>
-      <w:numFmt w:val="bullet"/>
-      <w:lvlText w:val=""/>
-      <w:lvlJc w:val="left"/>
-      <w:pPr>
-        <w:tabs>
-          <w:tab w:val="num" w:pos="3600"/>
-        </w:tabs>
-        <w:ind w:left="3600" w:hanging="360"/>
-      </w:pPr>
-      <w:rPr>
-        <w:rFonts w:ascii="Wingdings" w:hAnsi="Wingdings" w:hint="default"/>
-        <w:sz w:val="20"/>
-      </w:rPr>
-    </w:lvl>
-    <w:lvl w:ilvl="5" w:tentative="1">
-      <w:start w:val="1"/>
-      <w:numFmt w:val="bullet"/>
-      <w:lvlText w:val=""/>
-      <w:lvlJc w:val="left"/>
-      <w:pPr>
-        <w:tabs>
-          <w:tab w:val="num" w:pos="4320"/>
-        </w:tabs>
-        <w:ind w:left="4320" w:hanging="360"/>
-      </w:pPr>
-      <w:rPr>
-        <w:rFonts w:ascii="Wingdings" w:hAnsi="Wingdings" w:hint="default"/>
-        <w:sz w:val="20"/>
-      </w:rPr>
-    </w:lvl>
-    <w:lvl w:ilvl="6" w:tentative="1">
-      <w:start w:val="1"/>
-      <w:numFmt w:val="bullet"/>
-      <w:lvlText w:val=""/>
-      <w:lvlJc w:val="left"/>
-      <w:pPr>
-        <w:tabs>
-          <w:tab w:val="num" w:pos="5040"/>
-        </w:tabs>
-        <w:ind w:left="5040" w:hanging="360"/>
-      </w:pPr>
-      <w:rPr>
-        <w:rFonts w:ascii="Wingdings" w:hAnsi="Wingdings" w:hint="default"/>
-        <w:sz w:val="20"/>
-      </w:rPr>
-    </w:lvl>
-    <w:lvl w:ilvl="7" w:tentative="1">
-      <w:start w:val="1"/>
-      <w:numFmt w:val="bullet"/>
-      <w:lvlText w:val=""/>
-      <w:lvlJc w:val="left"/>
-      <w:pPr>
-        <w:tabs>
-          <w:tab w:val="num" w:pos="5760"/>
-        </w:tabs>
-        <w:ind w:left="5760" w:hanging="360"/>
-      </w:pPr>
-      <w:rPr>
-        <w:rFonts w:ascii="Wingdings" w:hAnsi="Wingdings" w:hint="default"/>
-        <w:sz w:val="20"/>
-      </w:rPr>
-    </w:lvl>
-    <w:lvl w:ilvl="8" w:tentative="1">
-      <w:start w:val="1"/>
-      <w:numFmt w:val="bullet"/>
-      <w:lvlText w:val=""/>
-      <w:lvlJc w:val="left"/>
-      <w:pPr>
-        <w:tabs>
-          <w:tab w:val="num" w:pos="6480"/>
-        </w:tabs>
-        <w:ind w:left="6480" w:hanging="360"/>
-      </w:pPr>
-      <w:rPr>
-        <w:rFonts w:ascii="Wingdings" w:hAnsi="Wingdings" w:hint="default"/>
-        <w:sz w:val="20"/>
-      </w:rPr>
-    </w:lvl>
-  </w:abstractNum>
-  <w:abstractNum w:abstractNumId="14" w15:restartNumberingAfterBreak="0">
+  <w:abstractNum w:abstractNumId="18" w15:restartNumberingAfterBreak="0">
     <w:nsid w:val="3FB07884"/>
     <w:multiLevelType w:val="multilevel"/>
     <w:tmpl w:val="3EF0D8BA"/>
@@ -7176,10 +8868,10 @@
       </w:rPr>
     </w:lvl>
   </w:abstractNum>
-  <w:abstractNum w:abstractNumId="15" w15:restartNumberingAfterBreak="0">
-    <w:nsid w:val="4DF903C1"/>
+  <w:abstractNum w:abstractNumId="19" w15:restartNumberingAfterBreak="0">
+    <w:nsid w:val="44AE0715"/>
     <w:multiLevelType w:val="multilevel"/>
-    <w:tmpl w:val="5A2EF948"/>
+    <w:tmpl w:val="C45E0600"/>
     <w:lvl w:ilvl="0">
       <w:start w:val="1"/>
       <w:numFmt w:val="bullet"/>
@@ -7196,603 +8888,7 @@
         <w:sz w:val="20"/>
       </w:rPr>
     </w:lvl>
-    <w:lvl w:ilvl="1">
-      <w:start w:val="1"/>
-      <w:numFmt w:val="bullet"/>
-      <w:lvlText w:val="o"/>
-      <w:lvlJc w:val="left"/>
-      <w:pPr>
-        <w:tabs>
-          <w:tab w:val="num" w:pos="1440"/>
-        </w:tabs>
-        <w:ind w:left="1440" w:hanging="360"/>
-      </w:pPr>
-      <w:rPr>
-        <w:rFonts w:ascii="Courier New" w:hAnsi="Courier New" w:hint="default"/>
-        <w:sz w:val="20"/>
-      </w:rPr>
-    </w:lvl>
-    <w:lvl w:ilvl="2" w:tentative="1">
-      <w:start w:val="1"/>
-      <w:numFmt w:val="bullet"/>
-      <w:lvlText w:val=""/>
-      <w:lvlJc w:val="left"/>
-      <w:pPr>
-        <w:tabs>
-          <w:tab w:val="num" w:pos="2160"/>
-        </w:tabs>
-        <w:ind w:left="2160" w:hanging="360"/>
-      </w:pPr>
-      <w:rPr>
-        <w:rFonts w:ascii="Wingdings" w:hAnsi="Wingdings" w:hint="default"/>
-        <w:sz w:val="20"/>
-      </w:rPr>
-    </w:lvl>
-    <w:lvl w:ilvl="3" w:tentative="1">
-      <w:start w:val="1"/>
-      <w:numFmt w:val="bullet"/>
-      <w:lvlText w:val=""/>
-      <w:lvlJc w:val="left"/>
-      <w:pPr>
-        <w:tabs>
-          <w:tab w:val="num" w:pos="2880"/>
-        </w:tabs>
-        <w:ind w:left="2880" w:hanging="360"/>
-      </w:pPr>
-      <w:rPr>
-        <w:rFonts w:ascii="Wingdings" w:hAnsi="Wingdings" w:hint="default"/>
-        <w:sz w:val="20"/>
-      </w:rPr>
-    </w:lvl>
-    <w:lvl w:ilvl="4" w:tentative="1">
-      <w:start w:val="1"/>
-      <w:numFmt w:val="bullet"/>
-      <w:lvlText w:val=""/>
-      <w:lvlJc w:val="left"/>
-      <w:pPr>
-        <w:tabs>
-          <w:tab w:val="num" w:pos="3600"/>
-        </w:tabs>
-        <w:ind w:left="3600" w:hanging="360"/>
-      </w:pPr>
-      <w:rPr>
-        <w:rFonts w:ascii="Wingdings" w:hAnsi="Wingdings" w:hint="default"/>
-        <w:sz w:val="20"/>
-      </w:rPr>
-    </w:lvl>
-    <w:lvl w:ilvl="5" w:tentative="1">
-      <w:start w:val="1"/>
-      <w:numFmt w:val="bullet"/>
-      <w:lvlText w:val=""/>
-      <w:lvlJc w:val="left"/>
-      <w:pPr>
-        <w:tabs>
-          <w:tab w:val="num" w:pos="4320"/>
-        </w:tabs>
-        <w:ind w:left="4320" w:hanging="360"/>
-      </w:pPr>
-      <w:rPr>
-        <w:rFonts w:ascii="Wingdings" w:hAnsi="Wingdings" w:hint="default"/>
-        <w:sz w:val="20"/>
-      </w:rPr>
-    </w:lvl>
-    <w:lvl w:ilvl="6" w:tentative="1">
-      <w:start w:val="1"/>
-      <w:numFmt w:val="bullet"/>
-      <w:lvlText w:val=""/>
-      <w:lvlJc w:val="left"/>
-      <w:pPr>
-        <w:tabs>
-          <w:tab w:val="num" w:pos="5040"/>
-        </w:tabs>
-        <w:ind w:left="5040" w:hanging="360"/>
-      </w:pPr>
-      <w:rPr>
-        <w:rFonts w:ascii="Wingdings" w:hAnsi="Wingdings" w:hint="default"/>
-        <w:sz w:val="20"/>
-      </w:rPr>
-    </w:lvl>
-    <w:lvl w:ilvl="7" w:tentative="1">
-      <w:start w:val="1"/>
-      <w:numFmt w:val="bullet"/>
-      <w:lvlText w:val=""/>
-      <w:lvlJc w:val="left"/>
-      <w:pPr>
-        <w:tabs>
-          <w:tab w:val="num" w:pos="5760"/>
-        </w:tabs>
-        <w:ind w:left="5760" w:hanging="360"/>
-      </w:pPr>
-      <w:rPr>
-        <w:rFonts w:ascii="Wingdings" w:hAnsi="Wingdings" w:hint="default"/>
-        <w:sz w:val="20"/>
-      </w:rPr>
-    </w:lvl>
-    <w:lvl w:ilvl="8" w:tentative="1">
-      <w:start w:val="1"/>
-      <w:numFmt w:val="bullet"/>
-      <w:lvlText w:val=""/>
-      <w:lvlJc w:val="left"/>
-      <w:pPr>
-        <w:tabs>
-          <w:tab w:val="num" w:pos="6480"/>
-        </w:tabs>
-        <w:ind w:left="6480" w:hanging="360"/>
-      </w:pPr>
-      <w:rPr>
-        <w:rFonts w:ascii="Wingdings" w:hAnsi="Wingdings" w:hint="default"/>
-        <w:sz w:val="20"/>
-      </w:rPr>
-    </w:lvl>
-  </w:abstractNum>
-  <w:abstractNum w:abstractNumId="16" w15:restartNumberingAfterBreak="0">
-    <w:nsid w:val="4E4736F7"/>
-    <w:multiLevelType w:val="multilevel"/>
-    <w:tmpl w:val="DAAC83AC"/>
-    <w:lvl w:ilvl="0">
-      <w:start w:val="1"/>
-      <w:numFmt w:val="bullet"/>
-      <w:lvlText w:val=""/>
-      <w:lvlJc w:val="left"/>
-      <w:pPr>
-        <w:tabs>
-          <w:tab w:val="num" w:pos="720"/>
-        </w:tabs>
-        <w:ind w:left="720" w:hanging="360"/>
-      </w:pPr>
-      <w:rPr>
-        <w:rFonts w:ascii="Symbol" w:hAnsi="Symbol" w:hint="default"/>
-        <w:sz w:val="20"/>
-      </w:rPr>
-    </w:lvl>
-    <w:lvl w:ilvl="1">
-      <w:start w:val="1"/>
-      <w:numFmt w:val="bullet"/>
-      <w:lvlText w:val="o"/>
-      <w:lvlJc w:val="left"/>
-      <w:pPr>
-        <w:tabs>
-          <w:tab w:val="num" w:pos="1440"/>
-        </w:tabs>
-        <w:ind w:left="1440" w:hanging="360"/>
-      </w:pPr>
-      <w:rPr>
-        <w:rFonts w:ascii="Courier New" w:hAnsi="Courier New" w:hint="default"/>
-        <w:sz w:val="20"/>
-      </w:rPr>
-    </w:lvl>
-    <w:lvl w:ilvl="2" w:tentative="1">
-      <w:start w:val="1"/>
-      <w:numFmt w:val="bullet"/>
-      <w:lvlText w:val=""/>
-      <w:lvlJc w:val="left"/>
-      <w:pPr>
-        <w:tabs>
-          <w:tab w:val="num" w:pos="2160"/>
-        </w:tabs>
-        <w:ind w:left="2160" w:hanging="360"/>
-      </w:pPr>
-      <w:rPr>
-        <w:rFonts w:ascii="Wingdings" w:hAnsi="Wingdings" w:hint="default"/>
-        <w:sz w:val="20"/>
-      </w:rPr>
-    </w:lvl>
-    <w:lvl w:ilvl="3" w:tentative="1">
-      <w:start w:val="1"/>
-      <w:numFmt w:val="bullet"/>
-      <w:lvlText w:val=""/>
-      <w:lvlJc w:val="left"/>
-      <w:pPr>
-        <w:tabs>
-          <w:tab w:val="num" w:pos="2880"/>
-        </w:tabs>
-        <w:ind w:left="2880" w:hanging="360"/>
-      </w:pPr>
-      <w:rPr>
-        <w:rFonts w:ascii="Wingdings" w:hAnsi="Wingdings" w:hint="default"/>
-        <w:sz w:val="20"/>
-      </w:rPr>
-    </w:lvl>
-    <w:lvl w:ilvl="4" w:tentative="1">
-      <w:start w:val="1"/>
-      <w:numFmt w:val="bullet"/>
-      <w:lvlText w:val=""/>
-      <w:lvlJc w:val="left"/>
-      <w:pPr>
-        <w:tabs>
-          <w:tab w:val="num" w:pos="3600"/>
-        </w:tabs>
-        <w:ind w:left="3600" w:hanging="360"/>
-      </w:pPr>
-      <w:rPr>
-        <w:rFonts w:ascii="Wingdings" w:hAnsi="Wingdings" w:hint="default"/>
-        <w:sz w:val="20"/>
-      </w:rPr>
-    </w:lvl>
-    <w:lvl w:ilvl="5" w:tentative="1">
-      <w:start w:val="1"/>
-      <w:numFmt w:val="bullet"/>
-      <w:lvlText w:val=""/>
-      <w:lvlJc w:val="left"/>
-      <w:pPr>
-        <w:tabs>
-          <w:tab w:val="num" w:pos="4320"/>
-        </w:tabs>
-        <w:ind w:left="4320" w:hanging="360"/>
-      </w:pPr>
-      <w:rPr>
-        <w:rFonts w:ascii="Wingdings" w:hAnsi="Wingdings" w:hint="default"/>
-        <w:sz w:val="20"/>
-      </w:rPr>
-    </w:lvl>
-    <w:lvl w:ilvl="6" w:tentative="1">
-      <w:start w:val="1"/>
-      <w:numFmt w:val="bullet"/>
-      <w:lvlText w:val=""/>
-      <w:lvlJc w:val="left"/>
-      <w:pPr>
-        <w:tabs>
-          <w:tab w:val="num" w:pos="5040"/>
-        </w:tabs>
-        <w:ind w:left="5040" w:hanging="360"/>
-      </w:pPr>
-      <w:rPr>
-        <w:rFonts w:ascii="Wingdings" w:hAnsi="Wingdings" w:hint="default"/>
-        <w:sz w:val="20"/>
-      </w:rPr>
-    </w:lvl>
-    <w:lvl w:ilvl="7" w:tentative="1">
-      <w:start w:val="1"/>
-      <w:numFmt w:val="bullet"/>
-      <w:lvlText w:val=""/>
-      <w:lvlJc w:val="left"/>
-      <w:pPr>
-        <w:tabs>
-          <w:tab w:val="num" w:pos="5760"/>
-        </w:tabs>
-        <w:ind w:left="5760" w:hanging="360"/>
-      </w:pPr>
-      <w:rPr>
-        <w:rFonts w:ascii="Wingdings" w:hAnsi="Wingdings" w:hint="default"/>
-        <w:sz w:val="20"/>
-      </w:rPr>
-    </w:lvl>
-    <w:lvl w:ilvl="8" w:tentative="1">
-      <w:start w:val="1"/>
-      <w:numFmt w:val="bullet"/>
-      <w:lvlText w:val=""/>
-      <w:lvlJc w:val="left"/>
-      <w:pPr>
-        <w:tabs>
-          <w:tab w:val="num" w:pos="6480"/>
-        </w:tabs>
-        <w:ind w:left="6480" w:hanging="360"/>
-      </w:pPr>
-      <w:rPr>
-        <w:rFonts w:ascii="Wingdings" w:hAnsi="Wingdings" w:hint="default"/>
-        <w:sz w:val="20"/>
-      </w:rPr>
-    </w:lvl>
-  </w:abstractNum>
-  <w:abstractNum w:abstractNumId="17" w15:restartNumberingAfterBreak="0">
-    <w:nsid w:val="4E9161ED"/>
-    <w:multiLevelType w:val="multilevel"/>
-    <w:tmpl w:val="19AAE0AA"/>
-    <w:lvl w:ilvl="0">
-      <w:start w:val="1"/>
-      <w:numFmt w:val="bullet"/>
-      <w:lvlText w:val=""/>
-      <w:lvlJc w:val="left"/>
-      <w:pPr>
-        <w:tabs>
-          <w:tab w:val="num" w:pos="720"/>
-        </w:tabs>
-        <w:ind w:left="720" w:hanging="360"/>
-      </w:pPr>
-      <w:rPr>
-        <w:rFonts w:ascii="Symbol" w:hAnsi="Symbol" w:hint="default"/>
-        <w:sz w:val="20"/>
-      </w:rPr>
-    </w:lvl>
-    <w:lvl w:ilvl="1">
-      <w:start w:val="1"/>
-      <w:numFmt w:val="bullet"/>
-      <w:lvlText w:val="o"/>
-      <w:lvlJc w:val="left"/>
-      <w:pPr>
-        <w:tabs>
-          <w:tab w:val="num" w:pos="1440"/>
-        </w:tabs>
-        <w:ind w:left="1440" w:hanging="360"/>
-      </w:pPr>
-      <w:rPr>
-        <w:rFonts w:ascii="Courier New" w:hAnsi="Courier New" w:hint="default"/>
-        <w:sz w:val="20"/>
-      </w:rPr>
-    </w:lvl>
-    <w:lvl w:ilvl="2" w:tentative="1">
-      <w:start w:val="1"/>
-      <w:numFmt w:val="bullet"/>
-      <w:lvlText w:val=""/>
-      <w:lvlJc w:val="left"/>
-      <w:pPr>
-        <w:tabs>
-          <w:tab w:val="num" w:pos="2160"/>
-        </w:tabs>
-        <w:ind w:left="2160" w:hanging="360"/>
-      </w:pPr>
-      <w:rPr>
-        <w:rFonts w:ascii="Wingdings" w:hAnsi="Wingdings" w:hint="default"/>
-        <w:sz w:val="20"/>
-      </w:rPr>
-    </w:lvl>
-    <w:lvl w:ilvl="3" w:tentative="1">
-      <w:start w:val="1"/>
-      <w:numFmt w:val="bullet"/>
-      <w:lvlText w:val=""/>
-      <w:lvlJc w:val="left"/>
-      <w:pPr>
-        <w:tabs>
-          <w:tab w:val="num" w:pos="2880"/>
-        </w:tabs>
-        <w:ind w:left="2880" w:hanging="360"/>
-      </w:pPr>
-      <w:rPr>
-        <w:rFonts w:ascii="Wingdings" w:hAnsi="Wingdings" w:hint="default"/>
-        <w:sz w:val="20"/>
-      </w:rPr>
-    </w:lvl>
-    <w:lvl w:ilvl="4" w:tentative="1">
-      <w:start w:val="1"/>
-      <w:numFmt w:val="bullet"/>
-      <w:lvlText w:val=""/>
-      <w:lvlJc w:val="left"/>
-      <w:pPr>
-        <w:tabs>
-          <w:tab w:val="num" w:pos="3600"/>
-        </w:tabs>
-        <w:ind w:left="3600" w:hanging="360"/>
-      </w:pPr>
-      <w:rPr>
-        <w:rFonts w:ascii="Wingdings" w:hAnsi="Wingdings" w:hint="default"/>
-        <w:sz w:val="20"/>
-      </w:rPr>
-    </w:lvl>
-    <w:lvl w:ilvl="5" w:tentative="1">
-      <w:start w:val="1"/>
-      <w:numFmt w:val="bullet"/>
-      <w:lvlText w:val=""/>
-      <w:lvlJc w:val="left"/>
-      <w:pPr>
-        <w:tabs>
-          <w:tab w:val="num" w:pos="4320"/>
-        </w:tabs>
-        <w:ind w:left="4320" w:hanging="360"/>
-      </w:pPr>
-      <w:rPr>
-        <w:rFonts w:ascii="Wingdings" w:hAnsi="Wingdings" w:hint="default"/>
-        <w:sz w:val="20"/>
-      </w:rPr>
-    </w:lvl>
-    <w:lvl w:ilvl="6" w:tentative="1">
-      <w:start w:val="1"/>
-      <w:numFmt w:val="bullet"/>
-      <w:lvlText w:val=""/>
-      <w:lvlJc w:val="left"/>
-      <w:pPr>
-        <w:tabs>
-          <w:tab w:val="num" w:pos="5040"/>
-        </w:tabs>
-        <w:ind w:left="5040" w:hanging="360"/>
-      </w:pPr>
-      <w:rPr>
-        <w:rFonts w:ascii="Wingdings" w:hAnsi="Wingdings" w:hint="default"/>
-        <w:sz w:val="20"/>
-      </w:rPr>
-    </w:lvl>
-    <w:lvl w:ilvl="7" w:tentative="1">
-      <w:start w:val="1"/>
-      <w:numFmt w:val="bullet"/>
-      <w:lvlText w:val=""/>
-      <w:lvlJc w:val="left"/>
-      <w:pPr>
-        <w:tabs>
-          <w:tab w:val="num" w:pos="5760"/>
-        </w:tabs>
-        <w:ind w:left="5760" w:hanging="360"/>
-      </w:pPr>
-      <w:rPr>
-        <w:rFonts w:ascii="Wingdings" w:hAnsi="Wingdings" w:hint="default"/>
-        <w:sz w:val="20"/>
-      </w:rPr>
-    </w:lvl>
-    <w:lvl w:ilvl="8" w:tentative="1">
-      <w:start w:val="1"/>
-      <w:numFmt w:val="bullet"/>
-      <w:lvlText w:val=""/>
-      <w:lvlJc w:val="left"/>
-      <w:pPr>
-        <w:tabs>
-          <w:tab w:val="num" w:pos="6480"/>
-        </w:tabs>
-        <w:ind w:left="6480" w:hanging="360"/>
-      </w:pPr>
-      <w:rPr>
-        <w:rFonts w:ascii="Wingdings" w:hAnsi="Wingdings" w:hint="default"/>
-        <w:sz w:val="20"/>
-      </w:rPr>
-    </w:lvl>
-  </w:abstractNum>
-  <w:abstractNum w:abstractNumId="18" w15:restartNumberingAfterBreak="0">
-    <w:nsid w:val="50D42261"/>
-    <w:multiLevelType w:val="multilevel"/>
-    <w:tmpl w:val="19E2636C"/>
-    <w:lvl w:ilvl="0">
-      <w:start w:val="1"/>
-      <w:numFmt w:val="bullet"/>
-      <w:lvlText w:val=""/>
-      <w:lvlJc w:val="left"/>
-      <w:pPr>
-        <w:tabs>
-          <w:tab w:val="num" w:pos="720"/>
-        </w:tabs>
-        <w:ind w:left="720" w:hanging="360"/>
-      </w:pPr>
-      <w:rPr>
-        <w:rFonts w:ascii="Symbol" w:hAnsi="Symbol" w:hint="default"/>
-        <w:sz w:val="20"/>
-      </w:rPr>
-    </w:lvl>
-    <w:lvl w:ilvl="1">
-      <w:start w:val="1"/>
-      <w:numFmt w:val="bullet"/>
-      <w:lvlText w:val="o"/>
-      <w:lvlJc w:val="left"/>
-      <w:pPr>
-        <w:tabs>
-          <w:tab w:val="num" w:pos="1440"/>
-        </w:tabs>
-        <w:ind w:left="1440" w:hanging="360"/>
-      </w:pPr>
-      <w:rPr>
-        <w:rFonts w:ascii="Courier New" w:hAnsi="Courier New" w:hint="default"/>
-        <w:sz w:val="20"/>
-      </w:rPr>
-    </w:lvl>
-    <w:lvl w:ilvl="2" w:tentative="1">
-      <w:start w:val="1"/>
-      <w:numFmt w:val="bullet"/>
-      <w:lvlText w:val=""/>
-      <w:lvlJc w:val="left"/>
-      <w:pPr>
-        <w:tabs>
-          <w:tab w:val="num" w:pos="2160"/>
-        </w:tabs>
-        <w:ind w:left="2160" w:hanging="360"/>
-      </w:pPr>
-      <w:rPr>
-        <w:rFonts w:ascii="Wingdings" w:hAnsi="Wingdings" w:hint="default"/>
-        <w:sz w:val="20"/>
-      </w:rPr>
-    </w:lvl>
-    <w:lvl w:ilvl="3" w:tentative="1">
-      <w:start w:val="1"/>
-      <w:numFmt w:val="bullet"/>
-      <w:lvlText w:val=""/>
-      <w:lvlJc w:val="left"/>
-      <w:pPr>
-        <w:tabs>
-          <w:tab w:val="num" w:pos="2880"/>
-        </w:tabs>
-        <w:ind w:left="2880" w:hanging="360"/>
-      </w:pPr>
-      <w:rPr>
-        <w:rFonts w:ascii="Wingdings" w:hAnsi="Wingdings" w:hint="default"/>
-        <w:sz w:val="20"/>
-      </w:rPr>
-    </w:lvl>
-    <w:lvl w:ilvl="4" w:tentative="1">
-      <w:start w:val="1"/>
-      <w:numFmt w:val="bullet"/>
-      <w:lvlText w:val=""/>
-      <w:lvlJc w:val="left"/>
-      <w:pPr>
-        <w:tabs>
-          <w:tab w:val="num" w:pos="3600"/>
-        </w:tabs>
-        <w:ind w:left="3600" w:hanging="360"/>
-      </w:pPr>
-      <w:rPr>
-        <w:rFonts w:ascii="Wingdings" w:hAnsi="Wingdings" w:hint="default"/>
-        <w:sz w:val="20"/>
-      </w:rPr>
-    </w:lvl>
-    <w:lvl w:ilvl="5" w:tentative="1">
-      <w:start w:val="1"/>
-      <w:numFmt w:val="bullet"/>
-      <w:lvlText w:val=""/>
-      <w:lvlJc w:val="left"/>
-      <w:pPr>
-        <w:tabs>
-          <w:tab w:val="num" w:pos="4320"/>
-        </w:tabs>
-        <w:ind w:left="4320" w:hanging="360"/>
-      </w:pPr>
-      <w:rPr>
-        <w:rFonts w:ascii="Wingdings" w:hAnsi="Wingdings" w:hint="default"/>
-        <w:sz w:val="20"/>
-      </w:rPr>
-    </w:lvl>
-    <w:lvl w:ilvl="6" w:tentative="1">
-      <w:start w:val="1"/>
-      <w:numFmt w:val="bullet"/>
-      <w:lvlText w:val=""/>
-      <w:lvlJc w:val="left"/>
-      <w:pPr>
-        <w:tabs>
-          <w:tab w:val="num" w:pos="5040"/>
-        </w:tabs>
-        <w:ind w:left="5040" w:hanging="360"/>
-      </w:pPr>
-      <w:rPr>
-        <w:rFonts w:ascii="Wingdings" w:hAnsi="Wingdings" w:hint="default"/>
-        <w:sz w:val="20"/>
-      </w:rPr>
-    </w:lvl>
-    <w:lvl w:ilvl="7" w:tentative="1">
-      <w:start w:val="1"/>
-      <w:numFmt w:val="bullet"/>
-      <w:lvlText w:val=""/>
-      <w:lvlJc w:val="left"/>
-      <w:pPr>
-        <w:tabs>
-          <w:tab w:val="num" w:pos="5760"/>
-        </w:tabs>
-        <w:ind w:left="5760" w:hanging="360"/>
-      </w:pPr>
-      <w:rPr>
-        <w:rFonts w:ascii="Wingdings" w:hAnsi="Wingdings" w:hint="default"/>
-        <w:sz w:val="20"/>
-      </w:rPr>
-    </w:lvl>
-    <w:lvl w:ilvl="8" w:tentative="1">
-      <w:start w:val="1"/>
-      <w:numFmt w:val="bullet"/>
-      <w:lvlText w:val=""/>
-      <w:lvlJc w:val="left"/>
-      <w:pPr>
-        <w:tabs>
-          <w:tab w:val="num" w:pos="6480"/>
-        </w:tabs>
-        <w:ind w:left="6480" w:hanging="360"/>
-      </w:pPr>
-      <w:rPr>
-        <w:rFonts w:ascii="Wingdings" w:hAnsi="Wingdings" w:hint="default"/>
-        <w:sz w:val="20"/>
-      </w:rPr>
-    </w:lvl>
-  </w:abstractNum>
-  <w:abstractNum w:abstractNumId="19" w15:restartNumberingAfterBreak="0">
-    <w:nsid w:val="571A5506"/>
-    <w:multiLevelType w:val="multilevel"/>
-    <w:tmpl w:val="1F205ED4"/>
-    <w:lvl w:ilvl="0">
-      <w:start w:val="1"/>
-      <w:numFmt w:val="bullet"/>
-      <w:lvlText w:val=""/>
-      <w:lvlJc w:val="left"/>
-      <w:pPr>
-        <w:tabs>
-          <w:tab w:val="num" w:pos="720"/>
-        </w:tabs>
-        <w:ind w:left="720" w:hanging="360"/>
-      </w:pPr>
-      <w:rPr>
-        <w:rFonts w:ascii="Symbol" w:hAnsi="Symbol" w:hint="default"/>
-        <w:sz w:val="20"/>
-      </w:rPr>
-    </w:lvl>
-    <w:lvl w:ilvl="1">
+    <w:lvl w:ilvl="1" w:tentative="1">
       <w:start w:val="1"/>
       <w:numFmt w:val="bullet"/>
       <w:lvlText w:val="o"/>
@@ -7922,9 +9018,9 @@
     </w:lvl>
   </w:abstractNum>
   <w:abstractNum w:abstractNumId="20" w15:restartNumberingAfterBreak="0">
-    <w:nsid w:val="583A60D1"/>
+    <w:nsid w:val="48A11749"/>
     <w:multiLevelType w:val="multilevel"/>
-    <w:tmpl w:val="11D0BEFC"/>
+    <w:tmpl w:val="1CE617B2"/>
     <w:lvl w:ilvl="0">
       <w:start w:val="1"/>
       <w:numFmt w:val="bullet"/>
@@ -7941,7 +9037,7 @@
         <w:sz w:val="20"/>
       </w:rPr>
     </w:lvl>
-    <w:lvl w:ilvl="1">
+    <w:lvl w:ilvl="1" w:tentative="1">
       <w:start w:val="1"/>
       <w:numFmt w:val="bullet"/>
       <w:lvlText w:val="o"/>
@@ -8071,9 +9167,9 @@
     </w:lvl>
   </w:abstractNum>
   <w:abstractNum w:abstractNumId="21" w15:restartNumberingAfterBreak="0">
-    <w:nsid w:val="59857E0F"/>
+    <w:nsid w:val="4A3A4E52"/>
     <w:multiLevelType w:val="multilevel"/>
-    <w:tmpl w:val="BDA050D8"/>
+    <w:tmpl w:val="CDD04436"/>
     <w:lvl w:ilvl="0">
       <w:start w:val="1"/>
       <w:numFmt w:val="bullet"/>
@@ -8090,7 +9186,7 @@
         <w:sz w:val="20"/>
       </w:rPr>
     </w:lvl>
-    <w:lvl w:ilvl="1">
+    <w:lvl w:ilvl="1" w:tentative="1">
       <w:start w:val="1"/>
       <w:numFmt w:val="bullet"/>
       <w:lvlText w:val="o"/>
@@ -8220,6 +9316,304 @@
     </w:lvl>
   </w:abstractNum>
   <w:abstractNum w:abstractNumId="22" w15:restartNumberingAfterBreak="0">
+    <w:nsid w:val="4ACB7F3A"/>
+    <w:multiLevelType w:val="multilevel"/>
+    <w:tmpl w:val="4998A87E"/>
+    <w:lvl w:ilvl="0">
+      <w:start w:val="1"/>
+      <w:numFmt w:val="bullet"/>
+      <w:lvlText w:val=""/>
+      <w:lvlJc w:val="left"/>
+      <w:pPr>
+        <w:tabs>
+          <w:tab w:val="num" w:pos="720"/>
+        </w:tabs>
+        <w:ind w:left="720" w:hanging="360"/>
+      </w:pPr>
+      <w:rPr>
+        <w:rFonts w:ascii="Symbol" w:hAnsi="Symbol" w:hint="default"/>
+        <w:sz w:val="20"/>
+      </w:rPr>
+    </w:lvl>
+    <w:lvl w:ilvl="1" w:tentative="1">
+      <w:start w:val="1"/>
+      <w:numFmt w:val="bullet"/>
+      <w:lvlText w:val="o"/>
+      <w:lvlJc w:val="left"/>
+      <w:pPr>
+        <w:tabs>
+          <w:tab w:val="num" w:pos="1440"/>
+        </w:tabs>
+        <w:ind w:left="1440" w:hanging="360"/>
+      </w:pPr>
+      <w:rPr>
+        <w:rFonts w:ascii="Courier New" w:hAnsi="Courier New" w:hint="default"/>
+        <w:sz w:val="20"/>
+      </w:rPr>
+    </w:lvl>
+    <w:lvl w:ilvl="2" w:tentative="1">
+      <w:start w:val="1"/>
+      <w:numFmt w:val="bullet"/>
+      <w:lvlText w:val=""/>
+      <w:lvlJc w:val="left"/>
+      <w:pPr>
+        <w:tabs>
+          <w:tab w:val="num" w:pos="2160"/>
+        </w:tabs>
+        <w:ind w:left="2160" w:hanging="360"/>
+      </w:pPr>
+      <w:rPr>
+        <w:rFonts w:ascii="Wingdings" w:hAnsi="Wingdings" w:hint="default"/>
+        <w:sz w:val="20"/>
+      </w:rPr>
+    </w:lvl>
+    <w:lvl w:ilvl="3" w:tentative="1">
+      <w:start w:val="1"/>
+      <w:numFmt w:val="bullet"/>
+      <w:lvlText w:val=""/>
+      <w:lvlJc w:val="left"/>
+      <w:pPr>
+        <w:tabs>
+          <w:tab w:val="num" w:pos="2880"/>
+        </w:tabs>
+        <w:ind w:left="2880" w:hanging="360"/>
+      </w:pPr>
+      <w:rPr>
+        <w:rFonts w:ascii="Wingdings" w:hAnsi="Wingdings" w:hint="default"/>
+        <w:sz w:val="20"/>
+      </w:rPr>
+    </w:lvl>
+    <w:lvl w:ilvl="4" w:tentative="1">
+      <w:start w:val="1"/>
+      <w:numFmt w:val="bullet"/>
+      <w:lvlText w:val=""/>
+      <w:lvlJc w:val="left"/>
+      <w:pPr>
+        <w:tabs>
+          <w:tab w:val="num" w:pos="3600"/>
+        </w:tabs>
+        <w:ind w:left="3600" w:hanging="360"/>
+      </w:pPr>
+      <w:rPr>
+        <w:rFonts w:ascii="Wingdings" w:hAnsi="Wingdings" w:hint="default"/>
+        <w:sz w:val="20"/>
+      </w:rPr>
+    </w:lvl>
+    <w:lvl w:ilvl="5" w:tentative="1">
+      <w:start w:val="1"/>
+      <w:numFmt w:val="bullet"/>
+      <w:lvlText w:val=""/>
+      <w:lvlJc w:val="left"/>
+      <w:pPr>
+        <w:tabs>
+          <w:tab w:val="num" w:pos="4320"/>
+        </w:tabs>
+        <w:ind w:left="4320" w:hanging="360"/>
+      </w:pPr>
+      <w:rPr>
+        <w:rFonts w:ascii="Wingdings" w:hAnsi="Wingdings" w:hint="default"/>
+        <w:sz w:val="20"/>
+      </w:rPr>
+    </w:lvl>
+    <w:lvl w:ilvl="6" w:tentative="1">
+      <w:start w:val="1"/>
+      <w:numFmt w:val="bullet"/>
+      <w:lvlText w:val=""/>
+      <w:lvlJc w:val="left"/>
+      <w:pPr>
+        <w:tabs>
+          <w:tab w:val="num" w:pos="5040"/>
+        </w:tabs>
+        <w:ind w:left="5040" w:hanging="360"/>
+      </w:pPr>
+      <w:rPr>
+        <w:rFonts w:ascii="Wingdings" w:hAnsi="Wingdings" w:hint="default"/>
+        <w:sz w:val="20"/>
+      </w:rPr>
+    </w:lvl>
+    <w:lvl w:ilvl="7" w:tentative="1">
+      <w:start w:val="1"/>
+      <w:numFmt w:val="bullet"/>
+      <w:lvlText w:val=""/>
+      <w:lvlJc w:val="left"/>
+      <w:pPr>
+        <w:tabs>
+          <w:tab w:val="num" w:pos="5760"/>
+        </w:tabs>
+        <w:ind w:left="5760" w:hanging="360"/>
+      </w:pPr>
+      <w:rPr>
+        <w:rFonts w:ascii="Wingdings" w:hAnsi="Wingdings" w:hint="default"/>
+        <w:sz w:val="20"/>
+      </w:rPr>
+    </w:lvl>
+    <w:lvl w:ilvl="8" w:tentative="1">
+      <w:start w:val="1"/>
+      <w:numFmt w:val="bullet"/>
+      <w:lvlText w:val=""/>
+      <w:lvlJc w:val="left"/>
+      <w:pPr>
+        <w:tabs>
+          <w:tab w:val="num" w:pos="6480"/>
+        </w:tabs>
+        <w:ind w:left="6480" w:hanging="360"/>
+      </w:pPr>
+      <w:rPr>
+        <w:rFonts w:ascii="Wingdings" w:hAnsi="Wingdings" w:hint="default"/>
+        <w:sz w:val="20"/>
+      </w:rPr>
+    </w:lvl>
+  </w:abstractNum>
+  <w:abstractNum w:abstractNumId="23" w15:restartNumberingAfterBreak="0">
+    <w:nsid w:val="504C2F52"/>
+    <w:multiLevelType w:val="multilevel"/>
+    <w:tmpl w:val="141AA26A"/>
+    <w:lvl w:ilvl="0">
+      <w:start w:val="1"/>
+      <w:numFmt w:val="bullet"/>
+      <w:lvlText w:val=""/>
+      <w:lvlJc w:val="left"/>
+      <w:pPr>
+        <w:tabs>
+          <w:tab w:val="num" w:pos="720"/>
+        </w:tabs>
+        <w:ind w:left="720" w:hanging="360"/>
+      </w:pPr>
+      <w:rPr>
+        <w:rFonts w:ascii="Symbol" w:hAnsi="Symbol" w:hint="default"/>
+        <w:sz w:val="20"/>
+      </w:rPr>
+    </w:lvl>
+    <w:lvl w:ilvl="1" w:tentative="1">
+      <w:start w:val="1"/>
+      <w:numFmt w:val="bullet"/>
+      <w:lvlText w:val="o"/>
+      <w:lvlJc w:val="left"/>
+      <w:pPr>
+        <w:tabs>
+          <w:tab w:val="num" w:pos="1440"/>
+        </w:tabs>
+        <w:ind w:left="1440" w:hanging="360"/>
+      </w:pPr>
+      <w:rPr>
+        <w:rFonts w:ascii="Courier New" w:hAnsi="Courier New" w:hint="default"/>
+        <w:sz w:val="20"/>
+      </w:rPr>
+    </w:lvl>
+    <w:lvl w:ilvl="2" w:tentative="1">
+      <w:start w:val="1"/>
+      <w:numFmt w:val="bullet"/>
+      <w:lvlText w:val=""/>
+      <w:lvlJc w:val="left"/>
+      <w:pPr>
+        <w:tabs>
+          <w:tab w:val="num" w:pos="2160"/>
+        </w:tabs>
+        <w:ind w:left="2160" w:hanging="360"/>
+      </w:pPr>
+      <w:rPr>
+        <w:rFonts w:ascii="Wingdings" w:hAnsi="Wingdings" w:hint="default"/>
+        <w:sz w:val="20"/>
+      </w:rPr>
+    </w:lvl>
+    <w:lvl w:ilvl="3" w:tentative="1">
+      <w:start w:val="1"/>
+      <w:numFmt w:val="bullet"/>
+      <w:lvlText w:val=""/>
+      <w:lvlJc w:val="left"/>
+      <w:pPr>
+        <w:tabs>
+          <w:tab w:val="num" w:pos="2880"/>
+        </w:tabs>
+        <w:ind w:left="2880" w:hanging="360"/>
+      </w:pPr>
+      <w:rPr>
+        <w:rFonts w:ascii="Wingdings" w:hAnsi="Wingdings" w:hint="default"/>
+        <w:sz w:val="20"/>
+      </w:rPr>
+    </w:lvl>
+    <w:lvl w:ilvl="4" w:tentative="1">
+      <w:start w:val="1"/>
+      <w:numFmt w:val="bullet"/>
+      <w:lvlText w:val=""/>
+      <w:lvlJc w:val="left"/>
+      <w:pPr>
+        <w:tabs>
+          <w:tab w:val="num" w:pos="3600"/>
+        </w:tabs>
+        <w:ind w:left="3600" w:hanging="360"/>
+      </w:pPr>
+      <w:rPr>
+        <w:rFonts w:ascii="Wingdings" w:hAnsi="Wingdings" w:hint="default"/>
+        <w:sz w:val="20"/>
+      </w:rPr>
+    </w:lvl>
+    <w:lvl w:ilvl="5" w:tentative="1">
+      <w:start w:val="1"/>
+      <w:numFmt w:val="bullet"/>
+      <w:lvlText w:val=""/>
+      <w:lvlJc w:val="left"/>
+      <w:pPr>
+        <w:tabs>
+          <w:tab w:val="num" w:pos="4320"/>
+        </w:tabs>
+        <w:ind w:left="4320" w:hanging="360"/>
+      </w:pPr>
+      <w:rPr>
+        <w:rFonts w:ascii="Wingdings" w:hAnsi="Wingdings" w:hint="default"/>
+        <w:sz w:val="20"/>
+      </w:rPr>
+    </w:lvl>
+    <w:lvl w:ilvl="6" w:tentative="1">
+      <w:start w:val="1"/>
+      <w:numFmt w:val="bullet"/>
+      <w:lvlText w:val=""/>
+      <w:lvlJc w:val="left"/>
+      <w:pPr>
+        <w:tabs>
+          <w:tab w:val="num" w:pos="5040"/>
+        </w:tabs>
+        <w:ind w:left="5040" w:hanging="360"/>
+      </w:pPr>
+      <w:rPr>
+        <w:rFonts w:ascii="Wingdings" w:hAnsi="Wingdings" w:hint="default"/>
+        <w:sz w:val="20"/>
+      </w:rPr>
+    </w:lvl>
+    <w:lvl w:ilvl="7" w:tentative="1">
+      <w:start w:val="1"/>
+      <w:numFmt w:val="bullet"/>
+      <w:lvlText w:val=""/>
+      <w:lvlJc w:val="left"/>
+      <w:pPr>
+        <w:tabs>
+          <w:tab w:val="num" w:pos="5760"/>
+        </w:tabs>
+        <w:ind w:left="5760" w:hanging="360"/>
+      </w:pPr>
+      <w:rPr>
+        <w:rFonts w:ascii="Wingdings" w:hAnsi="Wingdings" w:hint="default"/>
+        <w:sz w:val="20"/>
+      </w:rPr>
+    </w:lvl>
+    <w:lvl w:ilvl="8" w:tentative="1">
+      <w:start w:val="1"/>
+      <w:numFmt w:val="bullet"/>
+      <w:lvlText w:val=""/>
+      <w:lvlJc w:val="left"/>
+      <w:pPr>
+        <w:tabs>
+          <w:tab w:val="num" w:pos="6480"/>
+        </w:tabs>
+        <w:ind w:left="6480" w:hanging="360"/>
+      </w:pPr>
+      <w:rPr>
+        <w:rFonts w:ascii="Wingdings" w:hAnsi="Wingdings" w:hint="default"/>
+        <w:sz w:val="20"/>
+      </w:rPr>
+    </w:lvl>
+  </w:abstractNum>
+  <w:abstractNum w:abstractNumId="24" w15:restartNumberingAfterBreak="0">
     <w:nsid w:val="5D681C3C"/>
     <w:multiLevelType w:val="multilevel"/>
     <w:tmpl w:val="E500F47E"/>
@@ -8368,10 +9762,10 @@
       </w:rPr>
     </w:lvl>
   </w:abstractNum>
-  <w:abstractNum w:abstractNumId="23" w15:restartNumberingAfterBreak="0">
-    <w:nsid w:val="64E85489"/>
+  <w:abstractNum w:abstractNumId="25" w15:restartNumberingAfterBreak="0">
+    <w:nsid w:val="6323022C"/>
     <w:multiLevelType w:val="multilevel"/>
-    <w:tmpl w:val="90AE0B30"/>
+    <w:tmpl w:val="02E8C238"/>
     <w:lvl w:ilvl="0">
       <w:start w:val="1"/>
       <w:numFmt w:val="bullet"/>
@@ -8388,7 +9782,7 @@
         <w:sz w:val="20"/>
       </w:rPr>
     </w:lvl>
-    <w:lvl w:ilvl="1">
+    <w:lvl w:ilvl="1" w:tentative="1">
       <w:start w:val="1"/>
       <w:numFmt w:val="bullet"/>
       <w:lvlText w:val="o"/>
@@ -8517,7 +9911,7 @@
       </w:rPr>
     </w:lvl>
   </w:abstractNum>
-  <w:abstractNum w:abstractNumId="24" w15:restartNumberingAfterBreak="0">
+  <w:abstractNum w:abstractNumId="26" w15:restartNumberingAfterBreak="0">
     <w:nsid w:val="67ED42E2"/>
     <w:multiLevelType w:val="multilevel"/>
     <w:tmpl w:val="47063A38"/>
@@ -8666,7 +10060,7 @@
       </w:rPr>
     </w:lvl>
   </w:abstractNum>
-  <w:abstractNum w:abstractNumId="25" w15:restartNumberingAfterBreak="0">
+  <w:abstractNum w:abstractNumId="27" w15:restartNumberingAfterBreak="0">
     <w:nsid w:val="6B5273AE"/>
     <w:multiLevelType w:val="multilevel"/>
     <w:tmpl w:val="6F9ADE9E"/>
@@ -8815,7 +10209,7 @@
       </w:rPr>
     </w:lvl>
   </w:abstractNum>
-  <w:abstractNum w:abstractNumId="26" w15:restartNumberingAfterBreak="0">
+  <w:abstractNum w:abstractNumId="28" w15:restartNumberingAfterBreak="0">
     <w:nsid w:val="6C6657D9"/>
     <w:multiLevelType w:val="multilevel"/>
     <w:tmpl w:val="C70C8D3E"/>
@@ -8964,7 +10358,7 @@
       </w:rPr>
     </w:lvl>
   </w:abstractNum>
-  <w:abstractNum w:abstractNumId="27" w15:restartNumberingAfterBreak="0">
+  <w:abstractNum w:abstractNumId="29" w15:restartNumberingAfterBreak="0">
     <w:nsid w:val="6E0B66EF"/>
     <w:multiLevelType w:val="multilevel"/>
     <w:tmpl w:val="6F0EE45E"/>
@@ -9113,7 +10507,305 @@
       </w:rPr>
     </w:lvl>
   </w:abstractNum>
-  <w:abstractNum w:abstractNumId="28" w15:restartNumberingAfterBreak="0">
+  <w:abstractNum w:abstractNumId="30" w15:restartNumberingAfterBreak="0">
+    <w:nsid w:val="6F47385C"/>
+    <w:multiLevelType w:val="multilevel"/>
+    <w:tmpl w:val="B6348268"/>
+    <w:lvl w:ilvl="0">
+      <w:start w:val="1"/>
+      <w:numFmt w:val="bullet"/>
+      <w:lvlText w:val=""/>
+      <w:lvlJc w:val="left"/>
+      <w:pPr>
+        <w:tabs>
+          <w:tab w:val="num" w:pos="720"/>
+        </w:tabs>
+        <w:ind w:left="720" w:hanging="360"/>
+      </w:pPr>
+      <w:rPr>
+        <w:rFonts w:ascii="Symbol" w:hAnsi="Symbol" w:hint="default"/>
+        <w:sz w:val="20"/>
+      </w:rPr>
+    </w:lvl>
+    <w:lvl w:ilvl="1" w:tentative="1">
+      <w:start w:val="1"/>
+      <w:numFmt w:val="bullet"/>
+      <w:lvlText w:val="o"/>
+      <w:lvlJc w:val="left"/>
+      <w:pPr>
+        <w:tabs>
+          <w:tab w:val="num" w:pos="1440"/>
+        </w:tabs>
+        <w:ind w:left="1440" w:hanging="360"/>
+      </w:pPr>
+      <w:rPr>
+        <w:rFonts w:ascii="Courier New" w:hAnsi="Courier New" w:hint="default"/>
+        <w:sz w:val="20"/>
+      </w:rPr>
+    </w:lvl>
+    <w:lvl w:ilvl="2" w:tentative="1">
+      <w:start w:val="1"/>
+      <w:numFmt w:val="bullet"/>
+      <w:lvlText w:val=""/>
+      <w:lvlJc w:val="left"/>
+      <w:pPr>
+        <w:tabs>
+          <w:tab w:val="num" w:pos="2160"/>
+        </w:tabs>
+        <w:ind w:left="2160" w:hanging="360"/>
+      </w:pPr>
+      <w:rPr>
+        <w:rFonts w:ascii="Wingdings" w:hAnsi="Wingdings" w:hint="default"/>
+        <w:sz w:val="20"/>
+      </w:rPr>
+    </w:lvl>
+    <w:lvl w:ilvl="3" w:tentative="1">
+      <w:start w:val="1"/>
+      <w:numFmt w:val="bullet"/>
+      <w:lvlText w:val=""/>
+      <w:lvlJc w:val="left"/>
+      <w:pPr>
+        <w:tabs>
+          <w:tab w:val="num" w:pos="2880"/>
+        </w:tabs>
+        <w:ind w:left="2880" w:hanging="360"/>
+      </w:pPr>
+      <w:rPr>
+        <w:rFonts w:ascii="Wingdings" w:hAnsi="Wingdings" w:hint="default"/>
+        <w:sz w:val="20"/>
+      </w:rPr>
+    </w:lvl>
+    <w:lvl w:ilvl="4" w:tentative="1">
+      <w:start w:val="1"/>
+      <w:numFmt w:val="bullet"/>
+      <w:lvlText w:val=""/>
+      <w:lvlJc w:val="left"/>
+      <w:pPr>
+        <w:tabs>
+          <w:tab w:val="num" w:pos="3600"/>
+        </w:tabs>
+        <w:ind w:left="3600" w:hanging="360"/>
+      </w:pPr>
+      <w:rPr>
+        <w:rFonts w:ascii="Wingdings" w:hAnsi="Wingdings" w:hint="default"/>
+        <w:sz w:val="20"/>
+      </w:rPr>
+    </w:lvl>
+    <w:lvl w:ilvl="5" w:tentative="1">
+      <w:start w:val="1"/>
+      <w:numFmt w:val="bullet"/>
+      <w:lvlText w:val=""/>
+      <w:lvlJc w:val="left"/>
+      <w:pPr>
+        <w:tabs>
+          <w:tab w:val="num" w:pos="4320"/>
+        </w:tabs>
+        <w:ind w:left="4320" w:hanging="360"/>
+      </w:pPr>
+      <w:rPr>
+        <w:rFonts w:ascii="Wingdings" w:hAnsi="Wingdings" w:hint="default"/>
+        <w:sz w:val="20"/>
+      </w:rPr>
+    </w:lvl>
+    <w:lvl w:ilvl="6" w:tentative="1">
+      <w:start w:val="1"/>
+      <w:numFmt w:val="bullet"/>
+      <w:lvlText w:val=""/>
+      <w:lvlJc w:val="left"/>
+      <w:pPr>
+        <w:tabs>
+          <w:tab w:val="num" w:pos="5040"/>
+        </w:tabs>
+        <w:ind w:left="5040" w:hanging="360"/>
+      </w:pPr>
+      <w:rPr>
+        <w:rFonts w:ascii="Wingdings" w:hAnsi="Wingdings" w:hint="default"/>
+        <w:sz w:val="20"/>
+      </w:rPr>
+    </w:lvl>
+    <w:lvl w:ilvl="7" w:tentative="1">
+      <w:start w:val="1"/>
+      <w:numFmt w:val="bullet"/>
+      <w:lvlText w:val=""/>
+      <w:lvlJc w:val="left"/>
+      <w:pPr>
+        <w:tabs>
+          <w:tab w:val="num" w:pos="5760"/>
+        </w:tabs>
+        <w:ind w:left="5760" w:hanging="360"/>
+      </w:pPr>
+      <w:rPr>
+        <w:rFonts w:ascii="Wingdings" w:hAnsi="Wingdings" w:hint="default"/>
+        <w:sz w:val="20"/>
+      </w:rPr>
+    </w:lvl>
+    <w:lvl w:ilvl="8" w:tentative="1">
+      <w:start w:val="1"/>
+      <w:numFmt w:val="bullet"/>
+      <w:lvlText w:val=""/>
+      <w:lvlJc w:val="left"/>
+      <w:pPr>
+        <w:tabs>
+          <w:tab w:val="num" w:pos="6480"/>
+        </w:tabs>
+        <w:ind w:left="6480" w:hanging="360"/>
+      </w:pPr>
+      <w:rPr>
+        <w:rFonts w:ascii="Wingdings" w:hAnsi="Wingdings" w:hint="default"/>
+        <w:sz w:val="20"/>
+      </w:rPr>
+    </w:lvl>
+  </w:abstractNum>
+  <w:abstractNum w:abstractNumId="31" w15:restartNumberingAfterBreak="0">
+    <w:nsid w:val="719950B9"/>
+    <w:multiLevelType w:val="multilevel"/>
+    <w:tmpl w:val="41E0816A"/>
+    <w:lvl w:ilvl="0">
+      <w:start w:val="1"/>
+      <w:numFmt w:val="bullet"/>
+      <w:lvlText w:val=""/>
+      <w:lvlJc w:val="left"/>
+      <w:pPr>
+        <w:tabs>
+          <w:tab w:val="num" w:pos="720"/>
+        </w:tabs>
+        <w:ind w:left="720" w:hanging="360"/>
+      </w:pPr>
+      <w:rPr>
+        <w:rFonts w:ascii="Symbol" w:hAnsi="Symbol" w:hint="default"/>
+        <w:sz w:val="20"/>
+      </w:rPr>
+    </w:lvl>
+    <w:lvl w:ilvl="1" w:tentative="1">
+      <w:start w:val="1"/>
+      <w:numFmt w:val="bullet"/>
+      <w:lvlText w:val="o"/>
+      <w:lvlJc w:val="left"/>
+      <w:pPr>
+        <w:tabs>
+          <w:tab w:val="num" w:pos="1440"/>
+        </w:tabs>
+        <w:ind w:left="1440" w:hanging="360"/>
+      </w:pPr>
+      <w:rPr>
+        <w:rFonts w:ascii="Courier New" w:hAnsi="Courier New" w:hint="default"/>
+        <w:sz w:val="20"/>
+      </w:rPr>
+    </w:lvl>
+    <w:lvl w:ilvl="2" w:tentative="1">
+      <w:start w:val="1"/>
+      <w:numFmt w:val="bullet"/>
+      <w:lvlText w:val=""/>
+      <w:lvlJc w:val="left"/>
+      <w:pPr>
+        <w:tabs>
+          <w:tab w:val="num" w:pos="2160"/>
+        </w:tabs>
+        <w:ind w:left="2160" w:hanging="360"/>
+      </w:pPr>
+      <w:rPr>
+        <w:rFonts w:ascii="Wingdings" w:hAnsi="Wingdings" w:hint="default"/>
+        <w:sz w:val="20"/>
+      </w:rPr>
+    </w:lvl>
+    <w:lvl w:ilvl="3" w:tentative="1">
+      <w:start w:val="1"/>
+      <w:numFmt w:val="bullet"/>
+      <w:lvlText w:val=""/>
+      <w:lvlJc w:val="left"/>
+      <w:pPr>
+        <w:tabs>
+          <w:tab w:val="num" w:pos="2880"/>
+        </w:tabs>
+        <w:ind w:left="2880" w:hanging="360"/>
+      </w:pPr>
+      <w:rPr>
+        <w:rFonts w:ascii="Wingdings" w:hAnsi="Wingdings" w:hint="default"/>
+        <w:sz w:val="20"/>
+      </w:rPr>
+    </w:lvl>
+    <w:lvl w:ilvl="4" w:tentative="1">
+      <w:start w:val="1"/>
+      <w:numFmt w:val="bullet"/>
+      <w:lvlText w:val=""/>
+      <w:lvlJc w:val="left"/>
+      <w:pPr>
+        <w:tabs>
+          <w:tab w:val="num" w:pos="3600"/>
+        </w:tabs>
+        <w:ind w:left="3600" w:hanging="360"/>
+      </w:pPr>
+      <w:rPr>
+        <w:rFonts w:ascii="Wingdings" w:hAnsi="Wingdings" w:hint="default"/>
+        <w:sz w:val="20"/>
+      </w:rPr>
+    </w:lvl>
+    <w:lvl w:ilvl="5" w:tentative="1">
+      <w:start w:val="1"/>
+      <w:numFmt w:val="bullet"/>
+      <w:lvlText w:val=""/>
+      <w:lvlJc w:val="left"/>
+      <w:pPr>
+        <w:tabs>
+          <w:tab w:val="num" w:pos="4320"/>
+        </w:tabs>
+        <w:ind w:left="4320" w:hanging="360"/>
+      </w:pPr>
+      <w:rPr>
+        <w:rFonts w:ascii="Wingdings" w:hAnsi="Wingdings" w:hint="default"/>
+        <w:sz w:val="20"/>
+      </w:rPr>
+    </w:lvl>
+    <w:lvl w:ilvl="6" w:tentative="1">
+      <w:start w:val="1"/>
+      <w:numFmt w:val="bullet"/>
+      <w:lvlText w:val=""/>
+      <w:lvlJc w:val="left"/>
+      <w:pPr>
+        <w:tabs>
+          <w:tab w:val="num" w:pos="5040"/>
+        </w:tabs>
+        <w:ind w:left="5040" w:hanging="360"/>
+      </w:pPr>
+      <w:rPr>
+        <w:rFonts w:ascii="Wingdings" w:hAnsi="Wingdings" w:hint="default"/>
+        <w:sz w:val="20"/>
+      </w:rPr>
+    </w:lvl>
+    <w:lvl w:ilvl="7" w:tentative="1">
+      <w:start w:val="1"/>
+      <w:numFmt w:val="bullet"/>
+      <w:lvlText w:val=""/>
+      <w:lvlJc w:val="left"/>
+      <w:pPr>
+        <w:tabs>
+          <w:tab w:val="num" w:pos="5760"/>
+        </w:tabs>
+        <w:ind w:left="5760" w:hanging="360"/>
+      </w:pPr>
+      <w:rPr>
+        <w:rFonts w:ascii="Wingdings" w:hAnsi="Wingdings" w:hint="default"/>
+        <w:sz w:val="20"/>
+      </w:rPr>
+    </w:lvl>
+    <w:lvl w:ilvl="8" w:tentative="1">
+      <w:start w:val="1"/>
+      <w:numFmt w:val="bullet"/>
+      <w:lvlText w:val=""/>
+      <w:lvlJc w:val="left"/>
+      <w:pPr>
+        <w:tabs>
+          <w:tab w:val="num" w:pos="6480"/>
+        </w:tabs>
+        <w:ind w:left="6480" w:hanging="360"/>
+      </w:pPr>
+      <w:rPr>
+        <w:rFonts w:ascii="Wingdings" w:hAnsi="Wingdings" w:hint="default"/>
+        <w:sz w:val="20"/>
+      </w:rPr>
+    </w:lvl>
+  </w:abstractNum>
+  <w:abstractNum w:abstractNumId="32" w15:restartNumberingAfterBreak="0">
     <w:nsid w:val="72102F1F"/>
     <w:multiLevelType w:val="multilevel"/>
     <w:tmpl w:val="F208A948"/>
@@ -9262,10 +10954,10 @@
       </w:rPr>
     </w:lvl>
   </w:abstractNum>
-  <w:abstractNum w:abstractNumId="29" w15:restartNumberingAfterBreak="0">
-    <w:nsid w:val="77664AC5"/>
+  <w:abstractNum w:abstractNumId="33" w15:restartNumberingAfterBreak="0">
+    <w:nsid w:val="77B41775"/>
     <w:multiLevelType w:val="multilevel"/>
-    <w:tmpl w:val="58D09798"/>
+    <w:tmpl w:val="2E48C444"/>
     <w:lvl w:ilvl="0">
       <w:start w:val="1"/>
       <w:numFmt w:val="bullet"/>
@@ -9282,7 +10974,7 @@
         <w:sz w:val="20"/>
       </w:rPr>
     </w:lvl>
-    <w:lvl w:ilvl="1">
+    <w:lvl w:ilvl="1" w:tentative="1">
       <w:start w:val="1"/>
       <w:numFmt w:val="bullet"/>
       <w:lvlText w:val="o"/>
@@ -9411,7 +11103,7 @@
       </w:rPr>
     </w:lvl>
   </w:abstractNum>
-  <w:abstractNum w:abstractNumId="30" w15:restartNumberingAfterBreak="0">
+  <w:abstractNum w:abstractNumId="34" w15:restartNumberingAfterBreak="0">
     <w:nsid w:val="7F953FB7"/>
     <w:multiLevelType w:val="multilevel"/>
     <w:tmpl w:val="4628FA34"/>
@@ -9560,251 +11252,112 @@
       </w:rPr>
     </w:lvl>
   </w:abstractNum>
-  <w:abstractNum w:abstractNumId="31" w15:restartNumberingAfterBreak="0">
-    <w:nsid w:val="7FD97F9B"/>
-    <w:multiLevelType w:val="multilevel"/>
-    <w:tmpl w:val="89C27CA8"/>
-    <w:lvl w:ilvl="0">
-      <w:start w:val="1"/>
-      <w:numFmt w:val="bullet"/>
-      <w:lvlText w:val=""/>
-      <w:lvlJc w:val="left"/>
-      <w:pPr>
-        <w:tabs>
-          <w:tab w:val="num" w:pos="720"/>
-        </w:tabs>
-        <w:ind w:left="720" w:hanging="360"/>
-      </w:pPr>
-      <w:rPr>
-        <w:rFonts w:ascii="Symbol" w:hAnsi="Symbol" w:hint="default"/>
-        <w:sz w:val="20"/>
-      </w:rPr>
-    </w:lvl>
-    <w:lvl w:ilvl="1">
-      <w:start w:val="1"/>
-      <w:numFmt w:val="bullet"/>
-      <w:lvlText w:val="o"/>
-      <w:lvlJc w:val="left"/>
-      <w:pPr>
-        <w:tabs>
-          <w:tab w:val="num" w:pos="1440"/>
-        </w:tabs>
-        <w:ind w:left="1440" w:hanging="360"/>
-      </w:pPr>
-      <w:rPr>
-        <w:rFonts w:ascii="Courier New" w:hAnsi="Courier New" w:hint="default"/>
-        <w:sz w:val="20"/>
-      </w:rPr>
-    </w:lvl>
-    <w:lvl w:ilvl="2" w:tentative="1">
-      <w:start w:val="1"/>
-      <w:numFmt w:val="bullet"/>
-      <w:lvlText w:val=""/>
-      <w:lvlJc w:val="left"/>
-      <w:pPr>
-        <w:tabs>
-          <w:tab w:val="num" w:pos="2160"/>
-        </w:tabs>
-        <w:ind w:left="2160" w:hanging="360"/>
-      </w:pPr>
-      <w:rPr>
-        <w:rFonts w:ascii="Wingdings" w:hAnsi="Wingdings" w:hint="default"/>
-        <w:sz w:val="20"/>
-      </w:rPr>
-    </w:lvl>
-    <w:lvl w:ilvl="3" w:tentative="1">
-      <w:start w:val="1"/>
-      <w:numFmt w:val="bullet"/>
-      <w:lvlText w:val=""/>
-      <w:lvlJc w:val="left"/>
-      <w:pPr>
-        <w:tabs>
-          <w:tab w:val="num" w:pos="2880"/>
-        </w:tabs>
-        <w:ind w:left="2880" w:hanging="360"/>
-      </w:pPr>
-      <w:rPr>
-        <w:rFonts w:ascii="Wingdings" w:hAnsi="Wingdings" w:hint="default"/>
-        <w:sz w:val="20"/>
-      </w:rPr>
-    </w:lvl>
-    <w:lvl w:ilvl="4" w:tentative="1">
-      <w:start w:val="1"/>
-      <w:numFmt w:val="bullet"/>
-      <w:lvlText w:val=""/>
-      <w:lvlJc w:val="left"/>
-      <w:pPr>
-        <w:tabs>
-          <w:tab w:val="num" w:pos="3600"/>
-        </w:tabs>
-        <w:ind w:left="3600" w:hanging="360"/>
-      </w:pPr>
-      <w:rPr>
-        <w:rFonts w:ascii="Wingdings" w:hAnsi="Wingdings" w:hint="default"/>
-        <w:sz w:val="20"/>
-      </w:rPr>
-    </w:lvl>
-    <w:lvl w:ilvl="5" w:tentative="1">
-      <w:start w:val="1"/>
-      <w:numFmt w:val="bullet"/>
-      <w:lvlText w:val=""/>
-      <w:lvlJc w:val="left"/>
-      <w:pPr>
-        <w:tabs>
-          <w:tab w:val="num" w:pos="4320"/>
-        </w:tabs>
-        <w:ind w:left="4320" w:hanging="360"/>
-      </w:pPr>
-      <w:rPr>
-        <w:rFonts w:ascii="Wingdings" w:hAnsi="Wingdings" w:hint="default"/>
-        <w:sz w:val="20"/>
-      </w:rPr>
-    </w:lvl>
-    <w:lvl w:ilvl="6" w:tentative="1">
-      <w:start w:val="1"/>
-      <w:numFmt w:val="bullet"/>
-      <w:lvlText w:val=""/>
-      <w:lvlJc w:val="left"/>
-      <w:pPr>
-        <w:tabs>
-          <w:tab w:val="num" w:pos="5040"/>
-        </w:tabs>
-        <w:ind w:left="5040" w:hanging="360"/>
-      </w:pPr>
-      <w:rPr>
-        <w:rFonts w:ascii="Wingdings" w:hAnsi="Wingdings" w:hint="default"/>
-        <w:sz w:val="20"/>
-      </w:rPr>
-    </w:lvl>
-    <w:lvl w:ilvl="7" w:tentative="1">
-      <w:start w:val="1"/>
-      <w:numFmt w:val="bullet"/>
-      <w:lvlText w:val=""/>
-      <w:lvlJc w:val="left"/>
-      <w:pPr>
-        <w:tabs>
-          <w:tab w:val="num" w:pos="5760"/>
-        </w:tabs>
-        <w:ind w:left="5760" w:hanging="360"/>
-      </w:pPr>
-      <w:rPr>
-        <w:rFonts w:ascii="Wingdings" w:hAnsi="Wingdings" w:hint="default"/>
-        <w:sz w:val="20"/>
-      </w:rPr>
-    </w:lvl>
-    <w:lvl w:ilvl="8" w:tentative="1">
-      <w:start w:val="1"/>
-      <w:numFmt w:val="bullet"/>
-      <w:lvlText w:val=""/>
-      <w:lvlJc w:val="left"/>
-      <w:pPr>
-        <w:tabs>
-          <w:tab w:val="num" w:pos="6480"/>
-        </w:tabs>
-        <w:ind w:left="6480" w:hanging="360"/>
-      </w:pPr>
-      <w:rPr>
-        <w:rFonts w:ascii="Wingdings" w:hAnsi="Wingdings" w:hint="default"/>
-        <w:sz w:val="20"/>
-      </w:rPr>
-    </w:lvl>
-  </w:abstractNum>
   <w:num w:numId="1">
+    <w:abstractNumId w:val="7"/>
+  </w:num>
+  <w:num w:numId="2">
+    <w:abstractNumId w:val="26"/>
+  </w:num>
+  <w:num w:numId="3">
+    <w:abstractNumId w:val="27"/>
+  </w:num>
+  <w:num w:numId="4">
+    <w:abstractNumId w:val="34"/>
+  </w:num>
+  <w:num w:numId="5">
+    <w:abstractNumId w:val="13"/>
+  </w:num>
+  <w:num w:numId="6">
+    <w:abstractNumId w:val="32"/>
+  </w:num>
+  <w:num w:numId="7">
+    <w:abstractNumId w:val="24"/>
+  </w:num>
+  <w:num w:numId="8">
+    <w:abstractNumId w:val="0"/>
+  </w:num>
+  <w:num w:numId="9">
+    <w:abstractNumId w:val="15"/>
+  </w:num>
+  <w:num w:numId="10">
     <w:abstractNumId w:val="4"/>
   </w:num>
-  <w:num w:numId="2">
-    <w:abstractNumId w:val="24"/>
+  <w:num w:numId="11">
+    <w:abstractNumId w:val="16"/>
   </w:num>
-  <w:num w:numId="3">
+  <w:num w:numId="12">
+    <w:abstractNumId w:val="8"/>
+  </w:num>
+  <w:num w:numId="13">
+    <w:abstractNumId w:val="29"/>
+  </w:num>
+  <w:num w:numId="14">
+    <w:abstractNumId w:val="18"/>
+  </w:num>
+  <w:num w:numId="15">
+    <w:abstractNumId w:val="28"/>
+  </w:num>
+  <w:num w:numId="16">
+    <w:abstractNumId w:val="1"/>
+  </w:num>
+  <w:num w:numId="17">
+    <w:abstractNumId w:val="3"/>
+  </w:num>
+  <w:num w:numId="18">
+    <w:abstractNumId w:val="2"/>
+  </w:num>
+  <w:num w:numId="19">
+    <w:abstractNumId w:val="12"/>
+  </w:num>
+  <w:num w:numId="20">
+    <w:abstractNumId w:val="33"/>
+  </w:num>
+  <w:num w:numId="21">
+    <w:abstractNumId w:val="30"/>
+  </w:num>
+  <w:num w:numId="22">
+    <w:abstractNumId w:val="17"/>
+  </w:num>
+  <w:num w:numId="23">
+    <w:abstractNumId w:val="10"/>
+  </w:num>
+  <w:num w:numId="24">
     <w:abstractNumId w:val="25"/>
   </w:num>
-  <w:num w:numId="4">
-    <w:abstractNumId w:val="30"/>
+  <w:num w:numId="25">
+    <w:abstractNumId w:val="19"/>
   </w:num>
-  <w:num w:numId="5">
-    <w:abstractNumId w:val="8"/>
-  </w:num>
-  <w:num w:numId="6">
-    <w:abstractNumId w:val="28"/>
-  </w:num>
-  <w:num w:numId="7">
+  <w:num w:numId="26">
     <w:abstractNumId w:val="22"/>
   </w:num>
-  <w:num w:numId="8">
-    <w:abstractNumId w:val="1"/>
+  <w:num w:numId="27">
+    <w:abstractNumId w:val="20"/>
   </w:num>
-  <w:num w:numId="9">
-    <w:abstractNumId w:val="10"/>
+  <w:num w:numId="28">
+    <w:abstractNumId w:val="14"/>
   </w:num>
-  <w:num w:numId="10">
-    <w:abstractNumId w:val="15"/>
+  <w:num w:numId="29">
+    <w:abstractNumId w:val="31"/>
   </w:num>
-  <w:num w:numId="11">
-    <w:abstractNumId w:val="29"/>
+  <w:num w:numId="30">
+    <w:abstractNumId w:val="9"/>
   </w:num>
-  <w:num w:numId="12">
+  <w:num w:numId="31">
+    <w:abstractNumId w:val="23"/>
+  </w:num>
+  <w:num w:numId="32">
     <w:abstractNumId w:val="6"/>
   </w:num>
-  <w:num w:numId="13">
-    <w:abstractNumId w:val="18"/>
-  </w:num>
-  <w:num w:numId="14">
-    <w:abstractNumId w:val="17"/>
-  </w:num>
-  <w:num w:numId="15">
-    <w:abstractNumId w:val="12"/>
-  </w:num>
-  <w:num w:numId="16">
+  <w:num w:numId="33">
     <w:abstractNumId w:val="21"/>
   </w:num>
-  <w:num w:numId="17">
-    <w:abstractNumId w:val="0"/>
+  <w:num w:numId="34">
+    <w:abstractNumId w:val="5"/>
   </w:num>
-  <w:num w:numId="18">
-    <w:abstractNumId w:val="19"/>
-  </w:num>
-  <w:num w:numId="19">
-    <w:abstractNumId w:val="13"/>
-  </w:num>
-  <w:num w:numId="20">
-    <w:abstractNumId w:val="2"/>
-  </w:num>
-  <w:num w:numId="21">
-    <w:abstractNumId w:val="7"/>
-  </w:num>
-  <w:num w:numId="22">
-    <w:abstractNumId w:val="23"/>
-  </w:num>
-  <w:num w:numId="23">
-    <w:abstractNumId w:val="20"/>
-  </w:num>
-  <w:num w:numId="24">
-    <w:abstractNumId w:val="9"/>
-  </w:num>
-  <w:num w:numId="25">
-    <w:abstractNumId w:val="31"/>
-  </w:num>
-  <w:num w:numId="26">
-    <w:abstractNumId w:val="16"/>
-  </w:num>
-  <w:num w:numId="27">
-    <w:abstractNumId w:val="3"/>
-  </w:num>
-  <w:num w:numId="28">
+  <w:num w:numId="35">
     <w:abstractNumId w:val="11"/>
   </w:num>
-  <w:num w:numId="29">
-    <w:abstractNumId w:val="5"/>
-  </w:num>
-  <w:num w:numId="30">
-    <w:abstractNumId w:val="27"/>
-  </w:num>
-  <w:num w:numId="31">
-    <w:abstractNumId w:val="14"/>
-  </w:num>
-  <w:num w:numId="32">
-    <w:abstractNumId w:val="26"/>
-  </w:num>
+  <w:numIdMacAtCleanup w:val="35"/>
 </w:numbering>
 </file>
 
@@ -10202,6 +11755,29 @@
     <w:name w:val="Normal"/>
     <w:qFormat/>
   </w:style>
+  <w:style w:type="paragraph" w:styleId="Ttulo2">
+    <w:name w:val="heading 2"/>
+    <w:basedOn w:val="Normal"/>
+    <w:next w:val="Normal"/>
+    <w:link w:val="Ttulo2Car"/>
+    <w:uiPriority w:val="9"/>
+    <w:semiHidden/>
+    <w:unhideWhenUsed/>
+    <w:qFormat/>
+    <w:rsid w:val="00156C3A"/>
+    <w:pPr>
+      <w:keepNext/>
+      <w:keepLines/>
+      <w:spacing w:before="40" w:after="0"/>
+      <w:outlineLvl w:val="1"/>
+    </w:pPr>
+    <w:rPr>
+      <w:rFonts w:asciiTheme="majorHAnsi" w:eastAsiaTheme="majorEastAsia" w:hAnsiTheme="majorHAnsi" w:cstheme="majorBidi"/>
+      <w:color w:val="2E74B5" w:themeColor="accent1" w:themeShade="BF"/>
+      <w:sz w:val="26"/>
+      <w:szCs w:val="26"/>
+    </w:rPr>
+  </w:style>
   <w:style w:type="paragraph" w:styleId="Ttulo3">
     <w:name w:val="heading 3"/>
     <w:basedOn w:val="Normal"/>
@@ -10245,6 +11821,7 @@
   <w:style w:type="character" w:default="1" w:styleId="Fuentedeprrafopredeter">
     <w:name w:val="Default Paragraph Font"/>
     <w:uiPriority w:val="1"/>
+    <w:semiHidden/>
     <w:unhideWhenUsed/>
   </w:style>
   <w:style w:type="table" w:default="1" w:styleId="Tablanormal">
@@ -11149,6 +12726,20 @@
     <w:rPr>
       <w:b/>
       <w:bCs/>
+    </w:rPr>
+  </w:style>
+  <w:style w:type="character" w:customStyle="1" w:styleId="Ttulo2Car">
+    <w:name w:val="Título 2 Car"/>
+    <w:basedOn w:val="Fuentedeprrafopredeter"/>
+    <w:link w:val="Ttulo2"/>
+    <w:uiPriority w:val="9"/>
+    <w:semiHidden/>
+    <w:rsid w:val="00156C3A"/>
+    <w:rPr>
+      <w:rFonts w:asciiTheme="majorHAnsi" w:eastAsiaTheme="majorEastAsia" w:hAnsiTheme="majorHAnsi" w:cstheme="majorBidi"/>
+      <w:color w:val="2E74B5" w:themeColor="accent1" w:themeShade="BF"/>
+      <w:sz w:val="26"/>
+      <w:szCs w:val="26"/>
     </w:rPr>
   </w:style>
 </w:styles>

</xml_diff>